<commit_message>
updated the figures daniel mentioned, need to fix the isoscape still
</commit_message>
<xml_diff>
--- a/Docs/FeedbackIn/FIGURES Machine learning applied to otolith timeseries data to discriminate river of origin for Western Alaska Salmon.docx
+++ b/Docs/FeedbackIn/FIGURES Machine learning applied to otolith timeseries data to discriminate river of origin for Western Alaska Salmon.docx
@@ -19,19 +19,17 @@
           <w:szCs w:val="16"/>
         </w:rPr>
       </w:pPr>
-      <w:commentRangeStart w:id="0"/>
-      <w:r>
-        <w:rPr>
-          <w:rFonts w:ascii="Garamond" w:hAnsi="Garamond"/>
+      <w:r>
+        <w:rPr>
           <w:noProof/>
           <w:sz w:val="16"/>
           <w:szCs w:val="16"/>
         </w:rPr>
         <w:drawing>
-          <wp:inline distT="0" distB="0" distL="0" distR="0" wp14:anchorId="16BCAFDC" wp14:editId="1C26859F">
-            <wp:extent cx="4279392" cy="3306927"/>
-            <wp:effectExtent l="0" t="0" r="635" b="0"/>
-            <wp:docPr id="1728529224" name="Picture 3"/>
+          <wp:inline distT="0" distB="0" distL="0" distR="0" wp14:anchorId="4E9C1264" wp14:editId="78088F4F">
+            <wp:extent cx="4390631" cy="3392888"/>
+            <wp:effectExtent l="0" t="0" r="3810" b="0"/>
+            <wp:docPr id="1440452750" name="Picture 4"/>
             <wp:cNvGraphicFramePr>
               <a:graphicFrameLocks xmlns:a="http://schemas.openxmlformats.org/drawingml/2006/main" noChangeAspect="1"/>
             </wp:cNvGraphicFramePr>
@@ -39,7 +37,7 @@
               <a:graphicData uri="http://schemas.openxmlformats.org/drawingml/2006/picture">
                 <pic:pic xmlns:pic="http://schemas.openxmlformats.org/drawingml/2006/picture">
                   <pic:nvPicPr>
-                    <pic:cNvPr id="1728529224" name="Picture 1728529224"/>
+                    <pic:cNvPr id="1440452750" name="Picture 1440452750"/>
                     <pic:cNvPicPr/>
                   </pic:nvPicPr>
                   <pic:blipFill>
@@ -51,7 +49,7 @@
                   <pic:spPr>
                     <a:xfrm>
                       <a:off x="0" y="0"/>
-                      <a:ext cx="4312588" cy="3332580"/>
+                      <a:ext cx="4398851" cy="3399240"/>
                     </a:xfrm>
                     <a:prstGeom prst="rect">
                       <a:avLst/>
@@ -63,6 +61,7 @@
           </wp:inline>
         </w:drawing>
       </w:r>
+      <w:commentRangeStart w:id="0"/>
       <w:commentRangeEnd w:id="0"/>
       <w:r>
         <w:rPr>
@@ -78,10 +77,10 @@
           <w:szCs w:val="16"/>
         </w:rPr>
         <w:drawing>
-          <wp:inline distT="0" distB="0" distL="0" distR="0" wp14:anchorId="58F41200" wp14:editId="23CD41E6">
-            <wp:extent cx="4279265" cy="3306830"/>
-            <wp:effectExtent l="0" t="0" r="635" b="0"/>
-            <wp:docPr id="1119687362" name="Picture 4"/>
+          <wp:inline distT="0" distB="0" distL="0" distR="0" wp14:anchorId="5B93EE56" wp14:editId="25740597">
+            <wp:extent cx="4390910" cy="3393104"/>
+            <wp:effectExtent l="0" t="0" r="3810" b="0"/>
+            <wp:docPr id="1994492973" name="Picture 5"/>
             <wp:cNvGraphicFramePr>
               <a:graphicFrameLocks xmlns:a="http://schemas.openxmlformats.org/drawingml/2006/main" noChangeAspect="1"/>
             </wp:cNvGraphicFramePr>
@@ -89,7 +88,7 @@
               <a:graphicData uri="http://schemas.openxmlformats.org/drawingml/2006/picture">
                 <pic:pic xmlns:pic="http://schemas.openxmlformats.org/drawingml/2006/picture">
                   <pic:nvPicPr>
-                    <pic:cNvPr id="1119687362" name="Picture 1119687362"/>
+                    <pic:cNvPr id="1994492973" name="Picture 1994492973"/>
                     <pic:cNvPicPr/>
                   </pic:nvPicPr>
                   <pic:blipFill>
@@ -101,7 +100,7 @@
                   <pic:spPr>
                     <a:xfrm>
                       <a:off x="0" y="0"/>
-                      <a:ext cx="4312182" cy="3332267"/>
+                      <a:ext cx="4416287" cy="3412714"/>
                     </a:xfrm>
                     <a:prstGeom prst="rect">
                       <a:avLst/>
@@ -373,29 +372,21 @@
         </w:rPr>
         <w:t xml:space="preserve"> Model Performance comparison among data </w:t>
       </w:r>
-      <w:commentRangeStart w:id="2"/>
-      <w:r>
-        <w:rPr>
-          <w:rFonts w:ascii="Garamond" w:hAnsi="Garamond"/>
-          <w:sz w:val="16"/>
-          <w:szCs w:val="16"/>
-        </w:rPr>
-        <w:t>sources</w:t>
-      </w:r>
-      <w:commentRangeEnd w:id="2"/>
-      <w:r>
-        <w:rPr>
-          <w:rStyle w:val="CommentReference"/>
-        </w:rPr>
-        <w:commentReference w:id="2"/>
-      </w:r>
-      <w:r>
-        <w:rPr>
-          <w:rFonts w:ascii="Garamond" w:hAnsi="Garamond"/>
-          <w:sz w:val="16"/>
-          <w:szCs w:val="16"/>
-        </w:rPr>
-        <w:t xml:space="preserve"> and model types. Accuracy indicates the proportion of each class correctly classified. F1-Score is the harmonic mean of precision and recall, providing a balanced performance measure across all watershed classes. Results compare </w:t>
+      <w:r>
+        <w:rPr>
+          <w:rFonts w:ascii="Garamond" w:hAnsi="Garamond"/>
+          <w:sz w:val="16"/>
+          <w:szCs w:val="16"/>
+        </w:rPr>
+        <w:t xml:space="preserve">preprocessing steps </w:t>
+      </w:r>
+      <w:r>
+        <w:rPr>
+          <w:rFonts w:ascii="Garamond" w:hAnsi="Garamond"/>
+          <w:sz w:val="16"/>
+          <w:szCs w:val="16"/>
+        </w:rPr>
+        <w:t xml:space="preserve">and model types. Accuracy indicates the proportion of each class correctly classified. F1-Score is the harmonic mean of precision and recall, providing a balanced performance measure across all watershed classes. Results compare </w:t>
       </w:r>
       <w:r>
         <w:rPr>
@@ -636,77 +627,6 @@
       <w:pPr>
         <w:rPr>
           <w:rFonts w:ascii="Garamond" w:hAnsi="Garamond"/>
-          <w:sz w:val="16"/>
-          <w:szCs w:val="16"/>
-        </w:rPr>
-      </w:pPr>
-    </w:p>
-    <w:p/>
-    <w:p>
-      <w:commentRangeStart w:id="3"/>
-      <w:r>
-        <w:rPr>
-          <w:noProof/>
-        </w:rPr>
-        <w:lastRenderedPageBreak/>
-        <w:drawing>
-          <wp:inline distT="0" distB="0" distL="0" distR="0" wp14:anchorId="3CC31619" wp14:editId="11D0F073">
-            <wp:extent cx="2586182" cy="2159297"/>
-            <wp:effectExtent l="0" t="0" r="5080" b="0"/>
-            <wp:docPr id="555171451" name="Picture 1" descr="A graph of a number of individuals&#10;&#10;AI-generated content may be incorrect."/>
-            <wp:cNvGraphicFramePr>
-              <a:graphicFrameLocks xmlns:a="http://schemas.openxmlformats.org/drawingml/2006/main" noChangeAspect="1"/>
-            </wp:cNvGraphicFramePr>
-            <a:graphic xmlns:a="http://schemas.openxmlformats.org/drawingml/2006/main">
-              <a:graphicData uri="http://schemas.openxmlformats.org/drawingml/2006/picture">
-                <pic:pic xmlns:pic="http://schemas.openxmlformats.org/drawingml/2006/picture">
-                  <pic:nvPicPr>
-                    <pic:cNvPr id="555171451" name="Picture 1" descr="A graph of a number of individuals&#10;&#10;AI-generated content may be incorrect."/>
-                    <pic:cNvPicPr/>
-                  </pic:nvPicPr>
-                  <pic:blipFill>
-                    <a:blip r:embed="rId13"/>
-                    <a:stretch>
-                      <a:fillRect/>
-                    </a:stretch>
-                  </pic:blipFill>
-                  <pic:spPr>
-                    <a:xfrm>
-                      <a:off x="0" y="0"/>
-                      <a:ext cx="2616291" cy="2184436"/>
-                    </a:xfrm>
-                    <a:prstGeom prst="rect">
-                      <a:avLst/>
-                    </a:prstGeom>
-                  </pic:spPr>
-                </pic:pic>
-              </a:graphicData>
-            </a:graphic>
-          </wp:inline>
-        </w:drawing>
-      </w:r>
-      <w:commentRangeEnd w:id="3"/>
-      <w:r>
-        <w:rPr>
-          <w:rStyle w:val="CommentReference"/>
-        </w:rPr>
-        <w:commentReference w:id="3"/>
-      </w:r>
-    </w:p>
-    <w:p>
-      <w:pPr>
-        <w:jc w:val="center"/>
-        <w:rPr>
-          <w:rFonts w:ascii="Garamond" w:hAnsi="Garamond"/>
-          <w:sz w:val="16"/>
-          <w:szCs w:val="16"/>
-        </w:rPr>
-      </w:pPr>
-    </w:p>
-    <w:p>
-      <w:pPr>
-        <w:rPr>
-          <w:rFonts w:ascii="Garamond" w:hAnsi="Garamond"/>
           <w:b/>
           <w:bCs/>
           <w:sz w:val="16"/>
@@ -764,6 +684,7 @@
           <w:sz w:val="16"/>
           <w:szCs w:val="16"/>
         </w:rPr>
+        <w:lastRenderedPageBreak/>
         <w:drawing>
           <wp:anchor distT="0" distB="0" distL="114300" distR="114300" simplePos="0" relativeHeight="251658240" behindDoc="0" locked="0" layoutInCell="1" allowOverlap="1" wp14:anchorId="4608D8C9" wp14:editId="571A06E9">
             <wp:simplePos x="0" y="0"/>
@@ -788,7 +709,7 @@
                     <pic:cNvPicPr/>
                   </pic:nvPicPr>
                   <pic:blipFill>
-                    <a:blip r:embed="rId14" cstate="print">
+                    <a:blip r:embed="rId13" cstate="print">
                       <a:extLst>
                         <a:ext uri="{28A0092B-C50C-407E-A947-70E740481C1C}">
                           <a14:useLocalDpi xmlns:a14="http://schemas.microsoft.com/office/drawing/2010/main" val="0"/>
@@ -919,6 +840,114 @@
           <w:szCs w:val="16"/>
         </w:rPr>
       </w:pPr>
+    </w:p>
+    <w:p>
+      <w:pPr>
+        <w:rPr>
+          <w:rFonts w:ascii="Garamond" w:hAnsi="Garamond"/>
+          <w:sz w:val="16"/>
+          <w:szCs w:val="16"/>
+        </w:rPr>
+      </w:pPr>
+    </w:p>
+    <w:p>
+      <w:pPr>
+        <w:rPr>
+          <w:rFonts w:ascii="Garamond" w:hAnsi="Garamond"/>
+          <w:sz w:val="16"/>
+          <w:szCs w:val="16"/>
+        </w:rPr>
+      </w:pPr>
+    </w:p>
+    <w:p>
+      <w:pPr>
+        <w:rPr>
+          <w:rFonts w:ascii="Garamond" w:hAnsi="Garamond"/>
+          <w:sz w:val="16"/>
+          <w:szCs w:val="16"/>
+        </w:rPr>
+      </w:pPr>
+    </w:p>
+    <w:p>
+      <w:pPr>
+        <w:rPr>
+          <w:rFonts w:ascii="Garamond" w:hAnsi="Garamond"/>
+          <w:sz w:val="16"/>
+          <w:szCs w:val="16"/>
+        </w:rPr>
+      </w:pPr>
+    </w:p>
+    <w:p>
+      <w:pPr>
+        <w:rPr>
+          <w:rFonts w:ascii="Garamond" w:hAnsi="Garamond"/>
+          <w:sz w:val="16"/>
+          <w:szCs w:val="16"/>
+        </w:rPr>
+      </w:pPr>
+    </w:p>
+    <w:p>
+      <w:pPr>
+        <w:rPr>
+          <w:rFonts w:ascii="Garamond" w:hAnsi="Garamond"/>
+          <w:sz w:val="16"/>
+          <w:szCs w:val="16"/>
+        </w:rPr>
+      </w:pPr>
+    </w:p>
+    <w:p>
+      <w:pPr>
+        <w:rPr>
+          <w:rFonts w:ascii="Garamond" w:hAnsi="Garamond"/>
+          <w:sz w:val="16"/>
+          <w:szCs w:val="16"/>
+        </w:rPr>
+      </w:pPr>
+    </w:p>
+    <w:p>
+      <w:pPr>
+        <w:rPr>
+          <w:rFonts w:ascii="Garamond" w:hAnsi="Garamond"/>
+          <w:sz w:val="16"/>
+          <w:szCs w:val="16"/>
+        </w:rPr>
+      </w:pPr>
+    </w:p>
+    <w:p>
+      <w:pPr>
+        <w:rPr>
+          <w:rFonts w:ascii="Garamond" w:hAnsi="Garamond"/>
+          <w:sz w:val="16"/>
+          <w:szCs w:val="16"/>
+        </w:rPr>
+      </w:pPr>
+    </w:p>
+    <w:p>
+      <w:pPr>
+        <w:rPr>
+          <w:rFonts w:ascii="Garamond" w:hAnsi="Garamond"/>
+          <w:sz w:val="16"/>
+          <w:szCs w:val="16"/>
+        </w:rPr>
+      </w:pPr>
+    </w:p>
+    <w:p>
+      <w:pPr>
+        <w:rPr>
+          <w:rFonts w:ascii="Garamond" w:hAnsi="Garamond"/>
+          <w:sz w:val="16"/>
+          <w:szCs w:val="16"/>
+        </w:rPr>
+      </w:pPr>
+    </w:p>
+    <w:p>
+      <w:pPr>
+        <w:rPr>
+          <w:rFonts w:ascii="Garamond" w:hAnsi="Garamond"/>
+          <w:sz w:val="16"/>
+          <w:szCs w:val="16"/>
+        </w:rPr>
+      </w:pPr>
       <w:r>
         <w:rPr>
           <w:rFonts w:ascii="Garamond" w:hAnsi="Garamond"/>
@@ -928,10 +957,18 @@
         </w:rPr>
         <w:lastRenderedPageBreak/>
         <w:drawing>
-          <wp:inline distT="0" distB="0" distL="0" distR="0" wp14:anchorId="3106B05A" wp14:editId="6D19F2B2">
-            <wp:extent cx="1865515" cy="2984825"/>
-            <wp:effectExtent l="0" t="0" r="1905" b="0"/>
-            <wp:docPr id="1148715510" name="Picture 2"/>
+          <wp:anchor distT="0" distB="0" distL="114300" distR="114300" simplePos="0" relativeHeight="251659264" behindDoc="0" locked="0" layoutInCell="1" allowOverlap="1" wp14:anchorId="30DF671A" wp14:editId="6E381A55">
+            <wp:simplePos x="0" y="0"/>
+            <wp:positionH relativeFrom="column">
+              <wp:posOffset>1880870</wp:posOffset>
+            </wp:positionH>
+            <wp:positionV relativeFrom="paragraph">
+              <wp:posOffset>38090</wp:posOffset>
+            </wp:positionV>
+            <wp:extent cx="4378960" cy="3284220"/>
+            <wp:effectExtent l="0" t="0" r="2540" b="5080"/>
+            <wp:wrapSquare wrapText="bothSides"/>
+            <wp:docPr id="1678162362" name="Picture 3"/>
             <wp:cNvGraphicFramePr>
               <a:graphicFrameLocks xmlns:a="http://schemas.openxmlformats.org/drawingml/2006/main" noChangeAspect="1"/>
             </wp:cNvGraphicFramePr>
@@ -939,7 +976,64 @@
               <a:graphicData uri="http://schemas.openxmlformats.org/drawingml/2006/picture">
                 <pic:pic xmlns:pic="http://schemas.openxmlformats.org/drawingml/2006/picture">
                   <pic:nvPicPr>
-                    <pic:cNvPr id="1148715510" name="Picture 1148715510"/>
+                    <pic:cNvPr id="1678162362" name="Picture 1678162362"/>
+                    <pic:cNvPicPr/>
+                  </pic:nvPicPr>
+                  <pic:blipFill>
+                    <a:blip r:embed="rId14"/>
+                    <a:stretch>
+                      <a:fillRect/>
+                    </a:stretch>
+                  </pic:blipFill>
+                  <pic:spPr>
+                    <a:xfrm>
+                      <a:off x="0" y="0"/>
+                      <a:ext cx="4378960" cy="3284220"/>
+                    </a:xfrm>
+                    <a:prstGeom prst="rect">
+                      <a:avLst/>
+                    </a:prstGeom>
+                  </pic:spPr>
+                </pic:pic>
+              </a:graphicData>
+            </a:graphic>
+            <wp14:sizeRelH relativeFrom="page">
+              <wp14:pctWidth>0</wp14:pctWidth>
+            </wp14:sizeRelH>
+            <wp14:sizeRelV relativeFrom="page">
+              <wp14:pctHeight>0</wp14:pctHeight>
+            </wp14:sizeRelV>
+          </wp:anchor>
+        </w:drawing>
+      </w:r>
+      <w:r>
+        <w:rPr>
+          <w:rFonts w:ascii="Garamond" w:hAnsi="Garamond"/>
+          <w:noProof/>
+          <w:sz w:val="16"/>
+          <w:szCs w:val="16"/>
+        </w:rPr>
+        <w:drawing>
+          <wp:anchor distT="0" distB="0" distL="114300" distR="114300" simplePos="0" relativeHeight="251660288" behindDoc="0" locked="0" layoutInCell="1" allowOverlap="1" wp14:anchorId="2AA4B8A8" wp14:editId="5E7A1D85">
+            <wp:simplePos x="0" y="0"/>
+            <wp:positionH relativeFrom="column">
+              <wp:posOffset>-142875</wp:posOffset>
+            </wp:positionH>
+            <wp:positionV relativeFrom="paragraph">
+              <wp:posOffset>0</wp:posOffset>
+            </wp:positionV>
+            <wp:extent cx="2024380" cy="3322320"/>
+            <wp:effectExtent l="0" t="0" r="0" b="5080"/>
+            <wp:wrapSquare wrapText="bothSides"/>
+            <wp:docPr id="661460792" name="Picture 2"/>
+            <wp:cNvGraphicFramePr>
+              <a:graphicFrameLocks xmlns:a="http://schemas.openxmlformats.org/drawingml/2006/main" noChangeAspect="1"/>
+            </wp:cNvGraphicFramePr>
+            <a:graphic xmlns:a="http://schemas.openxmlformats.org/drawingml/2006/main">
+              <a:graphicData uri="http://schemas.openxmlformats.org/drawingml/2006/picture">
+                <pic:pic xmlns:pic="http://schemas.openxmlformats.org/drawingml/2006/picture">
+                  <pic:nvPicPr>
+                    <pic:cNvPr id="661460792" name="Picture 661460792"/>
                     <pic:cNvPicPr/>
                   </pic:nvPicPr>
                   <pic:blipFill>
@@ -951,7 +1045,7 @@
                   <pic:spPr>
                     <a:xfrm>
                       <a:off x="0" y="0"/>
-                      <a:ext cx="1930585" cy="3088937"/>
+                      <a:ext cx="2024380" cy="3322320"/>
                     </a:xfrm>
                     <a:prstGeom prst="rect">
                       <a:avLst/>
@@ -960,50 +1054,13 @@
                 </pic:pic>
               </a:graphicData>
             </a:graphic>
-          </wp:inline>
-        </w:drawing>
-      </w:r>
-      <w:r>
-        <w:rPr>
-          <w:rFonts w:ascii="Garamond" w:hAnsi="Garamond"/>
-          <w:noProof/>
-          <w:sz w:val="16"/>
-          <w:szCs w:val="16"/>
-        </w:rPr>
-        <w:drawing>
-          <wp:inline distT="0" distB="0" distL="0" distR="0" wp14:anchorId="25743AE2" wp14:editId="68E07C99">
-            <wp:extent cx="3980873" cy="2985654"/>
-            <wp:effectExtent l="0" t="0" r="0" b="0"/>
-            <wp:docPr id="1146811189" name="Picture 1"/>
-            <wp:cNvGraphicFramePr>
-              <a:graphicFrameLocks xmlns:a="http://schemas.openxmlformats.org/drawingml/2006/main" noChangeAspect="1"/>
-            </wp:cNvGraphicFramePr>
-            <a:graphic xmlns:a="http://schemas.openxmlformats.org/drawingml/2006/main">
-              <a:graphicData uri="http://schemas.openxmlformats.org/drawingml/2006/picture">
-                <pic:pic xmlns:pic="http://schemas.openxmlformats.org/drawingml/2006/picture">
-                  <pic:nvPicPr>
-                    <pic:cNvPr id="1146811189" name="Picture 1146811189"/>
-                    <pic:cNvPicPr/>
-                  </pic:nvPicPr>
-                  <pic:blipFill>
-                    <a:blip r:embed="rId16"/>
-                    <a:stretch>
-                      <a:fillRect/>
-                    </a:stretch>
-                  </pic:blipFill>
-                  <pic:spPr>
-                    <a:xfrm>
-                      <a:off x="0" y="0"/>
-                      <a:ext cx="4051417" cy="3038562"/>
-                    </a:xfrm>
-                    <a:prstGeom prst="rect">
-                      <a:avLst/>
-                    </a:prstGeom>
-                  </pic:spPr>
-                </pic:pic>
-              </a:graphicData>
-            </a:graphic>
-          </wp:inline>
+            <wp14:sizeRelH relativeFrom="page">
+              <wp14:pctWidth>0</wp14:pctWidth>
+            </wp14:sizeRelH>
+            <wp14:sizeRelV relativeFrom="page">
+              <wp14:pctHeight>0</wp14:pctHeight>
+            </wp14:sizeRelV>
+          </wp:anchor>
         </w:drawing>
       </w:r>
     </w:p>
@@ -1079,8 +1136,8 @@
         </w:rPr>
         <w:t xml:space="preserve">7085. Clustering among watersheds is evident between principal </w:t>
       </w:r>
-      <w:commentRangeStart w:id="4"/>
-      <w:commentRangeStart w:id="5"/>
+      <w:commentRangeStart w:id="2"/>
+      <w:commentRangeStart w:id="3"/>
       <w:r>
         <w:rPr>
           <w:rFonts w:ascii="Garamond" w:hAnsi="Garamond"/>
@@ -1089,19 +1146,19 @@
         </w:rPr>
         <w:t>components</w:t>
       </w:r>
-      <w:commentRangeEnd w:id="4"/>
+      <w:commentRangeEnd w:id="2"/>
       <w:r>
         <w:rPr>
           <w:rStyle w:val="CommentReference"/>
         </w:rPr>
-        <w:commentReference w:id="4"/>
-      </w:r>
-      <w:commentRangeEnd w:id="5"/>
+        <w:commentReference w:id="2"/>
+      </w:r>
+      <w:commentRangeEnd w:id="3"/>
       <w:r>
         <w:rPr>
           <w:rStyle w:val="CommentReference"/>
         </w:rPr>
-        <w:commentReference w:id="5"/>
+        <w:commentReference w:id="3"/>
       </w:r>
       <w:r>
         <w:rPr>
@@ -1328,7 +1385,7 @@
                     <pic:cNvPicPr/>
                   </pic:nvPicPr>
                   <pic:blipFill>
-                    <a:blip r:embed="rId17" cstate="print">
+                    <a:blip r:embed="rId16" cstate="print">
                       <a:extLst>
                         <a:ext uri="{28A0092B-C50C-407E-A947-70E740481C1C}">
                           <a14:useLocalDpi xmlns:a14="http://schemas.microsoft.com/office/drawing/2010/main" val="0"/>
@@ -1429,7 +1486,7 @@
       </w:r>
     </w:p>
   </w:comment>
-  <w:comment w:id="2" w:author="Daniel Schindler" w:date="2025-10-06T11:08:00Z" w:initials="DS">
+  <w:comment w:id="2" w:author="Daniel Schindler" w:date="2025-10-06T11:10:00Z" w:initials="DS">
     <w:p>
       <w:pPr>
         <w:pStyle w:val="CommentText"/>
@@ -1441,44 +1498,11 @@
         <w:annotationRef/>
       </w:r>
       <w:r>
-        <w:t>Are these really data sources? Or preprocessing processes. The data are the data….</w:t>
+        <w:t>This is a cool result which is not particularly well highlighted in the Discussion. Might want to think about how to highlight these results more.</w:t>
       </w:r>
     </w:p>
   </w:comment>
-  <w:comment w:id="3" w:author="bmak29" w:date="2025-09-07T15:55:00Z" w:initials="b">
-    <w:p>
-      <w:r>
-        <w:rPr>
-          <w:rStyle w:val="CommentReference"/>
-        </w:rPr>
-        <w:annotationRef/>
-      </w:r>
-      <w:r>
-        <w:rPr>
-          <w:sz w:val="20"/>
-          <w:szCs w:val="20"/>
-        </w:rPr>
-        <w:t>Thoughts on adding this to the above figure. This is ONLY the CWAK individuals. The only real difference is removing Middle+ Upper Yukon individuals leading to a pretty small sample size for Yukon</w:t>
-      </w:r>
-    </w:p>
-  </w:comment>
-  <w:comment w:id="4" w:author="Daniel Schindler" w:date="2025-10-06T11:10:00Z" w:initials="DS">
-    <w:p>
-      <w:pPr>
-        <w:pStyle w:val="CommentText"/>
-      </w:pPr>
-      <w:r>
-        <w:rPr>
-          <w:rStyle w:val="CommentReference"/>
-        </w:rPr>
-        <w:annotationRef/>
-      </w:r>
-      <w:r>
-        <w:t>This is a cool result which is not particularly well highlighted in the Discussion. Might want to think about how to highlight these results more.</w:t>
-      </w:r>
-    </w:p>
-  </w:comment>
-  <w:comment w:id="5" w:author="Daniel Schindler" w:date="2025-10-06T11:10:00Z" w:initials="DS">
+  <w:comment w:id="3" w:author="Daniel Schindler" w:date="2025-10-06T11:10:00Z" w:initials="DS">
     <w:p>
       <w:pPr>
         <w:pStyle w:val="CommentText"/>
@@ -1500,9 +1524,7 @@
 <file path=word/commentsExtended.xml><?xml version="1.0" encoding="utf-8"?>
 <w15:commentsEx xmlns:wpc="http://schemas.microsoft.com/office/word/2010/wordprocessingCanvas" xmlns:cx="http://schemas.microsoft.com/office/drawing/2014/chartex" xmlns:cx1="http://schemas.microsoft.com/office/drawing/2015/9/8/chartex" xmlns:cx2="http://schemas.microsoft.com/office/drawing/2015/10/21/chartex" xmlns:cx3="http://schemas.microsoft.com/office/drawing/2016/5/9/chartex" xmlns:cx4="http://schemas.microsoft.com/office/drawing/2016/5/10/chartex" xmlns:cx5="http://schemas.microsoft.com/office/drawing/2016/5/11/chartex" xmlns:cx6="http://schemas.microsoft.com/office/drawing/2016/5/12/chartex" xmlns:cx7="http://schemas.microsoft.com/office/drawing/2016/5/13/chartex" xmlns:cx8="http://schemas.microsoft.com/office/drawing/2016/5/14/chartex" xmlns:mc="http://schemas.openxmlformats.org/markup-compatibility/2006" xmlns:aink="http://schemas.microsoft.com/office/drawing/2016/ink" xmlns:am3d="http://schemas.microsoft.com/office/drawing/2017/model3d" xmlns:o="urn:schemas-microsoft-com:office:office" xmlns:oel="http://schemas.microsoft.com/office/2019/extlst" xmlns:r="http://schemas.openxmlformats.org/officeDocument/2006/relationships" xmlns:m="http://schemas.openxmlformats.org/officeDocument/2006/math" xmlns:v="urn:schemas-microsoft-com:vml" xmlns:wp14="http://schemas.microsoft.com/office/word/2010/wordprocessingDrawing" xmlns:wp="http://schemas.openxmlformats.org/drawingml/2006/wordprocessingDrawing" xmlns:w10="urn:schemas-microsoft-com:office:word" xmlns:w="http://schemas.openxmlformats.org/wordprocessingml/2006/main" xmlns:w14="http://schemas.microsoft.com/office/word/2010/wordml" xmlns:w15="http://schemas.microsoft.com/office/word/2012/wordml" xmlns:w16cex="http://schemas.microsoft.com/office/word/2018/wordml/cex" xmlns:w16cid="http://schemas.microsoft.com/office/word/2016/wordml/cid" xmlns:w16="http://schemas.microsoft.com/office/word/2018/wordml" xmlns:w16du="http://schemas.microsoft.com/office/word/2023/wordml/word16du" xmlns:w16sdtdh="http://schemas.microsoft.com/office/word/2020/wordml/sdtdatahash" xmlns:w16sdtfl="http://schemas.microsoft.com/office/word/2024/wordml/sdtformatlock" xmlns:w16se="http://schemas.microsoft.com/office/word/2015/wordml/symex" xmlns:wpg="http://schemas.microsoft.com/office/word/2010/wordprocessingGroup" xmlns:wpi="http://schemas.microsoft.com/office/word/2010/wordprocessingInk" xmlns:wne="http://schemas.microsoft.com/office/word/2006/wordml" xmlns:wps="http://schemas.microsoft.com/office/word/2010/wordprocessingShape" mc:Ignorable="w14 w15 w16se w16cid w16 w16cex w16sdtdh w16sdtfl w16du wp14">
   <w15:commentEx w15:paraId="384C15B7" w15:done="0"/>
-  <w15:commentEx w15:paraId="215C4347" w15:done="0"/>
-  <w15:commentEx w15:paraId="505C242A" w15:done="0"/>
-  <w15:commentEx w15:paraId="78A346C0" w15:done="0"/>
+  <w15:commentEx w15:paraId="215C4347" w15:done="1"/>
   <w15:commentEx w15:paraId="0DD29C92" w15:done="0"/>
   <w15:commentEx w15:paraId="40117E77" w15:paraIdParent="0DD29C92" w15:done="0"/>
 </w15:commentsEx>
@@ -1512,8 +1534,6 @@
 <w16cex:commentsExtensible xmlns:wpc="http://schemas.microsoft.com/office/word/2010/wordprocessingCanvas" xmlns:cx="http://schemas.microsoft.com/office/drawing/2014/chartex" xmlns:cx1="http://schemas.microsoft.com/office/drawing/2015/9/8/chartex" xmlns:cx2="http://schemas.microsoft.com/office/drawing/2015/10/21/chartex" xmlns:cx3="http://schemas.microsoft.com/office/drawing/2016/5/9/chartex" xmlns:cx4="http://schemas.microsoft.com/office/drawing/2016/5/10/chartex" xmlns:cx5="http://schemas.microsoft.com/office/drawing/2016/5/11/chartex" xmlns:cx6="http://schemas.microsoft.com/office/drawing/2016/5/12/chartex" xmlns:cx7="http://schemas.microsoft.com/office/drawing/2016/5/13/chartex" xmlns:cx8="http://schemas.microsoft.com/office/drawing/2016/5/14/chartex" xmlns:cr="http://schemas.microsoft.com/office/comments/2020/reactions" xmlns:mc="http://schemas.openxmlformats.org/markup-compatibility/2006" xmlns:aink="http://schemas.microsoft.com/office/drawing/2016/ink" xmlns:am3d="http://schemas.microsoft.com/office/drawing/2017/model3d" xmlns:o="urn:schemas-microsoft-com:office:office" xmlns:oel="http://schemas.microsoft.com/office/2019/extlst" xmlns:r="http://schemas.openxmlformats.org/officeDocument/2006/relationships" xmlns:m="http://schemas.openxmlformats.org/officeDocument/2006/math" xmlns:v="urn:schemas-microsoft-com:vml" xmlns:wp14="http://schemas.microsoft.com/office/word/2010/wordprocessingDrawing" xmlns:wp="http://schemas.openxmlformats.org/drawingml/2006/wordprocessingDrawing" xmlns:w10="urn:schemas-microsoft-com:office:word" xmlns:w="http://schemas.openxmlformats.org/wordprocessingml/2006/main" xmlns:w14="http://schemas.microsoft.com/office/word/2010/wordml" xmlns:w15="http://schemas.microsoft.com/office/word/2012/wordml" xmlns:w16cex="http://schemas.microsoft.com/office/word/2018/wordml/cex" xmlns:w16cid="http://schemas.microsoft.com/office/word/2016/wordml/cid" xmlns:w16="http://schemas.microsoft.com/office/word/2018/wordml" xmlns:w16du="http://schemas.microsoft.com/office/word/2023/wordml/word16du" xmlns:w16sdtdh="http://schemas.microsoft.com/office/word/2020/wordml/sdtdatahash" xmlns:w16sdtfl="http://schemas.microsoft.com/office/word/2024/wordml/sdtformatlock" xmlns:w16se="http://schemas.microsoft.com/office/word/2015/wordml/symex" xmlns:wpg="http://schemas.microsoft.com/office/word/2010/wordprocessingGroup" xmlns:wpi="http://schemas.microsoft.com/office/word/2010/wordprocessingInk" xmlns:wne="http://schemas.microsoft.com/office/word/2006/wordml" xmlns:wps="http://schemas.microsoft.com/office/word/2010/wordprocessingShape" mc:Ignorable="w14 w15 w16se w16cid w16 w16cex w16sdtdh w16sdtfl cr w16du wp14">
   <w16cex:commentExtensible w16cex:durableId="5B790A68" w16cex:dateUtc="2025-10-06T18:08:00Z"/>
   <w16cex:commentExtensible w16cex:durableId="282C9BDF" w16cex:dateUtc="2025-09-07T21:23:00Z"/>
-  <w16cex:commentExtensible w16cex:durableId="7F0FCE4B" w16cex:dateUtc="2025-10-06T18:08:00Z"/>
-  <w16cex:commentExtensible w16cex:durableId="52D97608" w16cex:dateUtc="2025-09-07T22:55:00Z"/>
   <w16cex:commentExtensible w16cex:durableId="11D61FD6" w16cex:dateUtc="2025-10-06T18:10:00Z"/>
   <w16cex:commentExtensible w16cex:durableId="7531CF4E" w16cex:dateUtc="2025-10-06T18:10:00Z"/>
 </w16cex:commentsExtensible>
@@ -1523,8 +1543,6 @@
 <w16cid:commentsIds xmlns:wpc="http://schemas.microsoft.com/office/word/2010/wordprocessingCanvas" xmlns:cx="http://schemas.microsoft.com/office/drawing/2014/chartex" xmlns:cx1="http://schemas.microsoft.com/office/drawing/2015/9/8/chartex" xmlns:cx2="http://schemas.microsoft.com/office/drawing/2015/10/21/chartex" xmlns:cx3="http://schemas.microsoft.com/office/drawing/2016/5/9/chartex" xmlns:cx4="http://schemas.microsoft.com/office/drawing/2016/5/10/chartex" xmlns:cx5="http://schemas.microsoft.com/office/drawing/2016/5/11/chartex" xmlns:cx6="http://schemas.microsoft.com/office/drawing/2016/5/12/chartex" xmlns:cx7="http://schemas.microsoft.com/office/drawing/2016/5/13/chartex" xmlns:cx8="http://schemas.microsoft.com/office/drawing/2016/5/14/chartex" xmlns:mc="http://schemas.openxmlformats.org/markup-compatibility/2006" xmlns:aink="http://schemas.microsoft.com/office/drawing/2016/ink" xmlns:am3d="http://schemas.microsoft.com/office/drawing/2017/model3d" xmlns:o="urn:schemas-microsoft-com:office:office" xmlns:oel="http://schemas.microsoft.com/office/2019/extlst" xmlns:r="http://schemas.openxmlformats.org/officeDocument/2006/relationships" xmlns:m="http://schemas.openxmlformats.org/officeDocument/2006/math" xmlns:v="urn:schemas-microsoft-com:vml" xmlns:wp14="http://schemas.microsoft.com/office/word/2010/wordprocessingDrawing" xmlns:wp="http://schemas.openxmlformats.org/drawingml/2006/wordprocessingDrawing" xmlns:w10="urn:schemas-microsoft-com:office:word" xmlns:w="http://schemas.openxmlformats.org/wordprocessingml/2006/main" xmlns:w14="http://schemas.microsoft.com/office/word/2010/wordml" xmlns:w15="http://schemas.microsoft.com/office/word/2012/wordml" xmlns:w16cex="http://schemas.microsoft.com/office/word/2018/wordml/cex" xmlns:w16cid="http://schemas.microsoft.com/office/word/2016/wordml/cid" xmlns:w16="http://schemas.microsoft.com/office/word/2018/wordml" xmlns:w16du="http://schemas.microsoft.com/office/word/2023/wordml/word16du" xmlns:w16sdtdh="http://schemas.microsoft.com/office/word/2020/wordml/sdtdatahash" xmlns:w16sdtfl="http://schemas.microsoft.com/office/word/2024/wordml/sdtformatlock" xmlns:w16se="http://schemas.microsoft.com/office/word/2015/wordml/symex" xmlns:wpg="http://schemas.microsoft.com/office/word/2010/wordprocessingGroup" xmlns:wpi="http://schemas.microsoft.com/office/word/2010/wordprocessingInk" xmlns:wne="http://schemas.microsoft.com/office/word/2006/wordml" xmlns:wps="http://schemas.microsoft.com/office/word/2010/wordprocessingShape" mc:Ignorable="w14 w15 w16se w16cid w16 w16cex w16sdtdh w16sdtfl w16du wp14">
   <w16cid:commentId w16cid:paraId="384C15B7" w16cid:durableId="5B790A68"/>
   <w16cid:commentId w16cid:paraId="215C4347" w16cid:durableId="282C9BDF"/>
-  <w16cid:commentId w16cid:paraId="505C242A" w16cid:durableId="7F0FCE4B"/>
-  <w16cid:commentId w16cid:paraId="78A346C0" w16cid:durableId="52D97608"/>
   <w16cid:commentId w16cid:paraId="0DD29C92" w16cid:durableId="11D61FD6"/>
   <w16cid:commentId w16cid:paraId="40117E77" w16cid:durableId="7531CF4E"/>
 </w16cid:commentsIds>
@@ -1536,9 +1554,6 @@
     <w15:presenceInfo w15:providerId="AD" w15:userId="S::deschind@uw.edu::638f7977-a89c-40df-b85e-dc804ddb30d9"/>
   </w15:person>
   <w15:person w15:author="Benjamin J. Makhlouf">
-    <w15:presenceInfo w15:providerId="AD" w15:userId="S::bmak29@uw.edu::e2d819b1-db99-41fc-888c-ad60b4d561ad"/>
-  </w15:person>
-  <w15:person w15:author="bmak29">
     <w15:presenceInfo w15:providerId="AD" w15:userId="S::bmak29@uw.edu::e2d819b1-db99-41fc-888c-ad60b4d561ad"/>
   </w15:person>
 </w15:people>

</xml_diff>

<commit_message>
updated average mainstem values etc
</commit_message>
<xml_diff>
--- a/Docs/FeedbackIn/FIGURES Machine learning applied to otolith timeseries data to discriminate river of origin for Western Alaska Salmon.docx
+++ b/Docs/FeedbackIn/FIGURES Machine learning applied to otolith timeseries data to discriminate river of origin for Western Alaska Salmon.docx
@@ -480,6 +480,24 @@
           <w:szCs w:val="16"/>
         </w:rPr>
       </w:pPr>
+    </w:p>
+    <w:p>
+      <w:pPr>
+        <w:rPr>
+          <w:rFonts w:ascii="Garamond" w:hAnsi="Garamond"/>
+          <w:sz w:val="16"/>
+          <w:szCs w:val="16"/>
+        </w:rPr>
+      </w:pPr>
+    </w:p>
+    <w:p>
+      <w:pPr>
+        <w:rPr>
+          <w:rFonts w:ascii="Garamond" w:hAnsi="Garamond"/>
+          <w:sz w:val="16"/>
+          <w:szCs w:val="16"/>
+        </w:rPr>
+      </w:pPr>
       <w:r>
         <w:rPr>
           <w:rFonts w:ascii="Garamond" w:hAnsi="Garamond"/>
@@ -684,7 +702,6 @@
           <w:sz w:val="16"/>
           <w:szCs w:val="16"/>
         </w:rPr>
-        <w:lastRenderedPageBreak/>
         <w:drawing>
           <wp:anchor distT="0" distB="0" distL="114300" distR="114300" simplePos="0" relativeHeight="251658240" behindDoc="0" locked="0" layoutInCell="1" allowOverlap="1" wp14:anchorId="4608D8C9" wp14:editId="571A06E9">
             <wp:simplePos x="0" y="0"/>

</xml_diff>

<commit_message>
re ordered figures and figure numbers in the ms
</commit_message>
<xml_diff>
--- a/Docs/FeedbackIn/FIGURES Machine learning applied to otolith timeseries data to discriminate river of origin for Western Alaska Salmon.docx
+++ b/Docs/FeedbackIn/FIGURES Machine learning applied to otolith timeseries data to discriminate river of origin for Western Alaska Salmon.docx
@@ -359,453 +359,22 @@
           <w:szCs w:val="16"/>
         </w:rPr>
       </w:pPr>
-    </w:p>
-    <w:p>
-      <w:pPr>
-        <w:rPr>
-          <w:rFonts w:ascii="Garamond" w:hAnsi="Garamond"/>
-          <w:b/>
-          <w:bCs/>
-          <w:sz w:val="16"/>
-          <w:szCs w:val="16"/>
-        </w:rPr>
-      </w:pPr>
-      <w:r>
-        <w:rPr>
-          <w:rFonts w:ascii="Garamond" w:hAnsi="Garamond"/>
-          <w:b/>
-          <w:bCs/>
+      <w:r>
+        <w:rPr>
+          <w:rFonts w:ascii="Garamond" w:hAnsi="Garamond"/>
           <w:noProof/>
           <w:sz w:val="16"/>
           <w:szCs w:val="16"/>
         </w:rPr>
-        <w:drawing>
-          <wp:inline distT="0" distB="0" distL="0" distR="0" wp14:anchorId="0EE2AE9C" wp14:editId="060AFD3D">
-            <wp:extent cx="5943600" cy="2054225"/>
-            <wp:effectExtent l="0" t="0" r="0" b="3175"/>
-            <wp:docPr id="887724946" name="Picture 1" descr="A close-up of a graph&#10;&#10;AI-generated content may be incorrect."/>
-            <wp:cNvGraphicFramePr>
-              <a:graphicFrameLocks xmlns:a="http://schemas.openxmlformats.org/drawingml/2006/main" noChangeAspect="1"/>
-            </wp:cNvGraphicFramePr>
-            <a:graphic xmlns:a="http://schemas.openxmlformats.org/drawingml/2006/main">
-              <a:graphicData uri="http://schemas.openxmlformats.org/drawingml/2006/picture">
-                <pic:pic xmlns:pic="http://schemas.openxmlformats.org/drawingml/2006/picture">
-                  <pic:nvPicPr>
-                    <pic:cNvPr id="887724946" name="Picture 1" descr="A close-up of a graph&#10;&#10;AI-generated content may be incorrect."/>
-                    <pic:cNvPicPr/>
-                  </pic:nvPicPr>
-                  <pic:blipFill>
-                    <a:blip r:embed="rId10"/>
-                    <a:stretch>
-                      <a:fillRect/>
-                    </a:stretch>
-                  </pic:blipFill>
-                  <pic:spPr>
-                    <a:xfrm>
-                      <a:off x="0" y="0"/>
-                      <a:ext cx="5943600" cy="2054225"/>
-                    </a:xfrm>
-                    <a:prstGeom prst="rect">
-                      <a:avLst/>
-                    </a:prstGeom>
-                  </pic:spPr>
-                </pic:pic>
-              </a:graphicData>
-            </a:graphic>
-          </wp:inline>
-        </w:drawing>
-      </w:r>
-    </w:p>
-    <w:p>
-      <w:pPr>
-        <w:rPr>
-          <w:rFonts w:ascii="Garamond" w:hAnsi="Garamond"/>
-          <w:sz w:val="16"/>
-          <w:szCs w:val="16"/>
-        </w:rPr>
-      </w:pPr>
-      <w:r>
-        <w:rPr>
-          <w:rFonts w:ascii="Garamond" w:hAnsi="Garamond"/>
-          <w:b/>
-          <w:bCs/>
-          <w:sz w:val="22"/>
-          <w:szCs w:val="22"/>
-        </w:rPr>
-        <w:t xml:space="preserve">Figure </w:t>
-      </w:r>
-      <w:r>
-        <w:rPr>
-          <w:rFonts w:ascii="Garamond" w:hAnsi="Garamond"/>
-          <w:b/>
-          <w:bCs/>
-          <w:sz w:val="22"/>
-          <w:szCs w:val="22"/>
-        </w:rPr>
-        <w:t>2</w:t>
-      </w:r>
-      <w:r>
-        <w:rPr>
-          <w:rFonts w:ascii="Garamond" w:hAnsi="Garamond"/>
-          <w:b/>
-          <w:bCs/>
-          <w:sz w:val="22"/>
-          <w:szCs w:val="22"/>
-        </w:rPr>
-        <w:t>:</w:t>
-      </w:r>
-      <w:r>
-        <w:rPr>
-          <w:rFonts w:ascii="Garamond" w:hAnsi="Garamond"/>
-          <w:sz w:val="16"/>
-          <w:szCs w:val="16"/>
-        </w:rPr>
-        <w:t xml:space="preserve"> </w:t>
-      </w:r>
-      <w:r>
-        <w:rPr>
-          <w:rFonts w:ascii="Garamond" w:hAnsi="Garamond"/>
-          <w:sz w:val="22"/>
-          <w:szCs w:val="22"/>
-        </w:rPr>
-        <w:t xml:space="preserve">Model Performance comparison among data </w:t>
-      </w:r>
-      <w:r>
-        <w:rPr>
-          <w:rFonts w:ascii="Garamond" w:hAnsi="Garamond"/>
-          <w:sz w:val="22"/>
-          <w:szCs w:val="22"/>
-        </w:rPr>
-        <w:t xml:space="preserve">preprocessing steps </w:t>
-      </w:r>
-      <w:r>
-        <w:rPr>
-          <w:rFonts w:ascii="Garamond" w:hAnsi="Garamond"/>
-          <w:sz w:val="22"/>
-          <w:szCs w:val="22"/>
-        </w:rPr>
-        <w:t xml:space="preserve">and model types. Accuracy indicates the proportion of each class correctly classified. F1-Score is the harmonic mean of precision and recall, providing a balanced performance measure across all watershed classes. Results compare </w:t>
-      </w:r>
-      <w:r>
-        <w:rPr>
-          <w:rFonts w:ascii="Garamond" w:hAnsi="Garamond"/>
-          <w:sz w:val="22"/>
-          <w:szCs w:val="22"/>
-        </w:rPr>
-        <w:t>two</w:t>
-      </w:r>
-      <w:r>
-        <w:rPr>
-          <w:rFonts w:ascii="Garamond" w:hAnsi="Garamond"/>
-          <w:sz w:val="22"/>
-          <w:szCs w:val="22"/>
-        </w:rPr>
-        <w:t xml:space="preserve"> </w:t>
-      </w:r>
-      <w:r>
-        <w:rPr>
-          <w:rFonts w:ascii="Cambria Math" w:hAnsi="Cambria Math" w:cs="Cambria Math"/>
-          <w:sz w:val="22"/>
-          <w:szCs w:val="22"/>
-        </w:rPr>
-        <w:t>⁸⁷</w:t>
-      </w:r>
-      <w:r>
-        <w:rPr>
-          <w:rFonts w:ascii="Garamond" w:hAnsi="Garamond"/>
-          <w:sz w:val="22"/>
-          <w:szCs w:val="22"/>
-        </w:rPr>
-        <w:t>Sr/</w:t>
-      </w:r>
-      <w:r>
-        <w:rPr>
-          <w:rFonts w:ascii="Cambria Math" w:hAnsi="Cambria Math" w:cs="Cambria Math"/>
-          <w:sz w:val="22"/>
-          <w:szCs w:val="22"/>
-        </w:rPr>
-        <w:t>⁸⁶</w:t>
-      </w:r>
-      <w:r>
-        <w:rPr>
-          <w:rFonts w:ascii="Garamond" w:hAnsi="Garamond"/>
-          <w:sz w:val="22"/>
-          <w:szCs w:val="22"/>
-        </w:rPr>
-        <w:t xml:space="preserve">Sr </w:t>
-      </w:r>
-      <w:r>
-        <w:rPr>
-          <w:rFonts w:ascii="Garamond" w:hAnsi="Garamond"/>
-          <w:sz w:val="22"/>
-          <w:szCs w:val="22"/>
-        </w:rPr>
-        <w:t xml:space="preserve">timeseries smoothing </w:t>
-      </w:r>
-      <w:r>
-        <w:rPr>
-          <w:rFonts w:ascii="Garamond" w:hAnsi="Garamond"/>
-          <w:sz w:val="22"/>
-          <w:szCs w:val="22"/>
-        </w:rPr>
-        <w:t xml:space="preserve">methods (GAM, MA) </w:t>
-      </w:r>
-      <w:r>
-        <w:rPr>
-          <w:rFonts w:ascii="Garamond" w:hAnsi="Garamond"/>
-          <w:sz w:val="22"/>
-          <w:szCs w:val="22"/>
-        </w:rPr>
-        <w:t>a</w:t>
-      </w:r>
-      <w:r>
-        <w:rPr>
-          <w:rFonts w:ascii="Garamond" w:hAnsi="Garamond"/>
-          <w:sz w:val="22"/>
-          <w:szCs w:val="22"/>
-        </w:rPr>
-        <w:t xml:space="preserve">nd three machine learning algorithms (Random Forest, SVM, KNN) using either all test data (Total) or only overlapping isotope ranges (Overlapping). </w:t>
-      </w:r>
-      <w:r>
-        <w:rPr>
-          <w:rFonts w:ascii="Garamond" w:hAnsi="Garamond"/>
-          <w:sz w:val="22"/>
-          <w:szCs w:val="22"/>
-        </w:rPr>
-        <w:t>Darker green colors indicate higher scores</w:t>
-      </w:r>
-      <w:r>
-        <w:rPr>
-          <w:rFonts w:ascii="Garamond" w:hAnsi="Garamond"/>
-          <w:sz w:val="16"/>
-          <w:szCs w:val="16"/>
-        </w:rPr>
-        <w:t>.</w:t>
-      </w:r>
-    </w:p>
-    <w:p>
-      <w:pPr>
-        <w:rPr>
-          <w:rFonts w:ascii="Garamond" w:hAnsi="Garamond"/>
-          <w:sz w:val="16"/>
-          <w:szCs w:val="16"/>
-        </w:rPr>
-      </w:pPr>
-    </w:p>
-    <w:p>
-      <w:pPr>
-        <w:rPr>
-          <w:rFonts w:ascii="Garamond" w:hAnsi="Garamond"/>
-          <w:sz w:val="16"/>
-          <w:szCs w:val="16"/>
-        </w:rPr>
-      </w:pPr>
-      <w:r>
-        <w:rPr>
-          <w:rFonts w:ascii="Garamond" w:hAnsi="Garamond"/>
-          <w:noProof/>
-          <w:sz w:val="16"/>
-          <w:szCs w:val="16"/>
-        </w:rPr>
-        <w:drawing>
-          <wp:inline distT="0" distB="0" distL="0" distR="0" wp14:anchorId="16679699" wp14:editId="668105C7">
-            <wp:extent cx="5962810" cy="2981405"/>
-            <wp:effectExtent l="0" t="0" r="6350" b="3175"/>
-            <wp:docPr id="1789130704" name="Picture 6"/>
-            <wp:cNvGraphicFramePr>
-              <a:graphicFrameLocks xmlns:a="http://schemas.openxmlformats.org/drawingml/2006/main" noChangeAspect="1"/>
-            </wp:cNvGraphicFramePr>
-            <a:graphic xmlns:a="http://schemas.openxmlformats.org/drawingml/2006/main">
-              <a:graphicData uri="http://schemas.openxmlformats.org/drawingml/2006/picture">
-                <pic:pic xmlns:pic="http://schemas.openxmlformats.org/drawingml/2006/picture">
-                  <pic:nvPicPr>
-                    <pic:cNvPr id="1789130704" name="Picture 1789130704"/>
-                    <pic:cNvPicPr/>
-                  </pic:nvPicPr>
-                  <pic:blipFill>
-                    <a:blip r:embed="rId11"/>
-                    <a:stretch>
-                      <a:fillRect/>
-                    </a:stretch>
-                  </pic:blipFill>
-                  <pic:spPr>
-                    <a:xfrm>
-                      <a:off x="0" y="0"/>
-                      <a:ext cx="5988578" cy="2994289"/>
-                    </a:xfrm>
-                    <a:prstGeom prst="rect">
-                      <a:avLst/>
-                    </a:prstGeom>
-                  </pic:spPr>
-                </pic:pic>
-              </a:graphicData>
-            </a:graphic>
-          </wp:inline>
-        </w:drawing>
-      </w:r>
-      <w:r>
-        <w:rPr>
-          <w:rFonts w:ascii="Garamond" w:hAnsi="Garamond"/>
-          <w:sz w:val="16"/>
-          <w:szCs w:val="16"/>
-        </w:rPr>
-        <w:t xml:space="preserve"> </w:t>
-      </w:r>
-    </w:p>
-    <w:p>
-      <w:pPr>
-        <w:rPr>
-          <w:rFonts w:ascii="Garamond" w:hAnsi="Garamond"/>
-          <w:sz w:val="22"/>
-          <w:szCs w:val="22"/>
-        </w:rPr>
-      </w:pPr>
-      <w:r>
-        <w:rPr>
-          <w:rFonts w:ascii="Garamond" w:hAnsi="Garamond"/>
-          <w:b/>
-          <w:bCs/>
-          <w:sz w:val="22"/>
-          <w:szCs w:val="22"/>
-        </w:rPr>
-        <w:t>Figure 3:</w:t>
-      </w:r>
-      <w:r>
-        <w:rPr>
-          <w:rFonts w:ascii="Garamond" w:hAnsi="Garamond"/>
-          <w:sz w:val="22"/>
-          <w:szCs w:val="22"/>
-        </w:rPr>
-        <w:t xml:space="preserve"> </w:t>
-      </w:r>
-      <w:commentRangeStart w:id="2"/>
-      <w:r>
-        <w:rPr>
-          <w:rFonts w:ascii="Garamond" w:hAnsi="Garamond"/>
-          <w:sz w:val="22"/>
-          <w:szCs w:val="22"/>
-        </w:rPr>
-        <w:t>Confusion</w:t>
-      </w:r>
-      <w:commentRangeEnd w:id="2"/>
-      <w:r>
-        <w:rPr>
-          <w:rStyle w:val="CommentReference"/>
-        </w:rPr>
-        <w:commentReference w:id="2"/>
-      </w:r>
-      <w:r>
-        <w:rPr>
-          <w:rFonts w:ascii="Garamond" w:hAnsi="Garamond"/>
-          <w:sz w:val="22"/>
-          <w:szCs w:val="22"/>
-        </w:rPr>
-        <w:t xml:space="preserve"> matrix from the highest p</w:t>
-      </w:r>
-      <w:r>
-        <w:rPr>
-          <w:rFonts w:ascii="Garamond" w:hAnsi="Garamond"/>
-          <w:sz w:val="22"/>
-          <w:szCs w:val="22"/>
-        </w:rPr>
-        <w:t>er</w:t>
-      </w:r>
-      <w:r>
-        <w:rPr>
-          <w:rFonts w:ascii="Garamond" w:hAnsi="Garamond"/>
-          <w:sz w:val="22"/>
-          <w:szCs w:val="22"/>
-        </w:rPr>
-        <w:t xml:space="preserve">forming model (Random Forest on GAM Smoothed data) for both total </w:t>
-      </w:r>
-      <w:proofErr w:type="gramStart"/>
-      <w:r>
-        <w:rPr>
-          <w:rFonts w:ascii="Garamond" w:hAnsi="Garamond"/>
-          <w:sz w:val="22"/>
-          <w:szCs w:val="22"/>
-        </w:rPr>
-        <w:t>test</w:t>
-      </w:r>
-      <w:proofErr w:type="gramEnd"/>
-      <w:r>
-        <w:rPr>
-          <w:rFonts w:ascii="Garamond" w:hAnsi="Garamond"/>
-          <w:sz w:val="22"/>
-          <w:szCs w:val="22"/>
-        </w:rPr>
-        <w:t xml:space="preserve"> set and overlapping subset. Boxes along the horizontal axis indicate correctly classified individuals</w:t>
-      </w:r>
-      <w:r>
-        <w:rPr>
-          <w:rFonts w:ascii="Garamond" w:hAnsi="Garamond"/>
-          <w:sz w:val="22"/>
-          <w:szCs w:val="22"/>
-        </w:rPr>
-        <w:t xml:space="preserve"> (red). Vertical axis labels are the actual watershed labels whereas horizontal labels are the predicted class from the model. Percentage</w:t>
-      </w:r>
-      <w:r>
-        <w:rPr>
-          <w:rFonts w:ascii="Garamond" w:hAnsi="Garamond"/>
-          <w:sz w:val="22"/>
-          <w:szCs w:val="22"/>
-        </w:rPr>
-        <w:t>s indicate</w:t>
-      </w:r>
-      <w:r>
-        <w:rPr>
-          <w:rFonts w:ascii="Garamond" w:hAnsi="Garamond"/>
-          <w:sz w:val="22"/>
-          <w:szCs w:val="22"/>
-        </w:rPr>
-        <w:t xml:space="preserve"> the percent of the actual class identified as the predicted class. </w:t>
-      </w:r>
-      <w:r>
-        <w:rPr>
-          <w:rFonts w:ascii="Garamond" w:hAnsi="Garamond"/>
-          <w:sz w:val="22"/>
-          <w:szCs w:val="22"/>
-        </w:rPr>
-        <w:t xml:space="preserve">  </w:t>
-      </w:r>
-    </w:p>
-    <w:p>
-      <w:pPr>
-        <w:rPr>
-          <w:rFonts w:ascii="Garamond" w:hAnsi="Garamond"/>
-          <w:b/>
-          <w:bCs/>
-          <w:sz w:val="16"/>
-          <w:szCs w:val="16"/>
-        </w:rPr>
-      </w:pPr>
-    </w:p>
-    <w:p>
-      <w:pPr>
-        <w:rPr>
-          <w:rFonts w:ascii="Garamond" w:hAnsi="Garamond"/>
-          <w:b/>
-          <w:bCs/>
-          <w:sz w:val="16"/>
-          <w:szCs w:val="16"/>
-        </w:rPr>
-      </w:pPr>
-      <w:r>
-        <w:rPr>
-          <w:rFonts w:ascii="Garamond" w:hAnsi="Garamond"/>
-          <w:noProof/>
-          <w:sz w:val="16"/>
-          <w:szCs w:val="16"/>
-        </w:rPr>
         <w:lastRenderedPageBreak/>
         <w:drawing>
-          <wp:anchor distT="0" distB="0" distL="114300" distR="114300" simplePos="0" relativeHeight="251658240" behindDoc="0" locked="0" layoutInCell="1" allowOverlap="1" wp14:anchorId="4608D8C9" wp14:editId="1B8CF4B2">
+          <wp:anchor distT="0" distB="0" distL="114300" distR="114300" simplePos="0" relativeHeight="251658240" behindDoc="0" locked="0" layoutInCell="1" allowOverlap="1" wp14:anchorId="4608D8C9" wp14:editId="4163B2FD">
             <wp:simplePos x="0" y="0"/>
             <wp:positionH relativeFrom="column">
-              <wp:posOffset>-222885</wp:posOffset>
+              <wp:posOffset>-80645</wp:posOffset>
             </wp:positionH>
             <wp:positionV relativeFrom="paragraph">
-              <wp:posOffset>268605</wp:posOffset>
+              <wp:posOffset>0</wp:posOffset>
             </wp:positionV>
             <wp:extent cx="5962650" cy="4968875"/>
             <wp:effectExtent l="0" t="0" r="6350" b="0"/>
@@ -822,7 +391,7 @@
                     <pic:cNvPicPr/>
                   </pic:nvPicPr>
                   <pic:blipFill>
-                    <a:blip r:embed="rId12" cstate="print">
+                    <a:blip r:embed="rId10" cstate="print">
                       <a:extLst>
                         <a:ext uri="{28A0092B-C50C-407E-A947-70E740481C1C}">
                           <a14:useLocalDpi xmlns:a14="http://schemas.microsoft.com/office/drawing/2010/main" val="0"/>
@@ -859,17 +428,13 @@
       <w:pPr>
         <w:rPr>
           <w:rFonts w:ascii="Garamond" w:hAnsi="Garamond"/>
-          <w:sz w:val="22"/>
-          <w:szCs w:val="22"/>
-        </w:rPr>
-      </w:pPr>
-      <w:r>
-        <w:rPr>
-          <w:rFonts w:ascii="Garamond" w:hAnsi="Garamond"/>
-          <w:b/>
-          <w:bCs/>
-          <w:sz w:val="22"/>
-          <w:szCs w:val="22"/>
+        </w:rPr>
+      </w:pPr>
+      <w:r>
+        <w:rPr>
+          <w:rFonts w:ascii="Garamond" w:hAnsi="Garamond"/>
+          <w:b/>
+          <w:bCs/>
         </w:rPr>
         <w:t xml:space="preserve">Figure </w:t>
       </w:r>
@@ -878,174 +443,91 @@
           <w:rFonts w:ascii="Garamond" w:hAnsi="Garamond"/>
           <w:b/>
           <w:bCs/>
-          <w:sz w:val="22"/>
-          <w:szCs w:val="22"/>
-        </w:rPr>
-        <w:t>4</w:t>
-      </w:r>
-      <w:r>
-        <w:rPr>
-          <w:rFonts w:ascii="Garamond" w:hAnsi="Garamond"/>
-          <w:b/>
-          <w:bCs/>
-          <w:sz w:val="22"/>
-          <w:szCs w:val="22"/>
+        </w:rPr>
+        <w:t>2</w:t>
+      </w:r>
+      <w:r>
+        <w:rPr>
+          <w:rFonts w:ascii="Garamond" w:hAnsi="Garamond"/>
+          <w:b/>
+          <w:bCs/>
         </w:rPr>
         <w:t>:</w:t>
       </w:r>
       <w:r>
         <w:rPr>
           <w:rFonts w:ascii="Garamond" w:hAnsi="Garamond"/>
-          <w:sz w:val="22"/>
-          <w:szCs w:val="22"/>
-        </w:rPr>
-        <w:t xml:space="preserve"> Principal Component analysis of </w:t>
-      </w:r>
-      <w:del w:id="3" w:author="Daniel Schindler" w:date="2025-10-25T09:35:00Z" w16du:dateUtc="2025-10-25T16:35:00Z">
-        <w:r>
-          <w:rPr>
-            <w:rFonts w:ascii="Garamond" w:hAnsi="Garamond"/>
-            <w:sz w:val="22"/>
-            <w:szCs w:val="22"/>
-          </w:rPr>
-          <w:delText xml:space="preserve">gam </w:delText>
-        </w:r>
-      </w:del>
-      <w:ins w:id="4" w:author="Daniel Schindler" w:date="2025-10-25T09:35:00Z" w16du:dateUtc="2025-10-25T16:35:00Z">
-        <w:r>
-          <w:rPr>
-            <w:rFonts w:ascii="Garamond" w:hAnsi="Garamond"/>
-            <w:sz w:val="22"/>
-            <w:szCs w:val="22"/>
-          </w:rPr>
-          <w:t>GAM</w:t>
-        </w:r>
-        <w:r>
-          <w:rPr>
-            <w:rFonts w:ascii="Garamond" w:hAnsi="Garamond"/>
-            <w:sz w:val="22"/>
-            <w:szCs w:val="22"/>
-          </w:rPr>
-          <w:t xml:space="preserve"> </w:t>
-        </w:r>
-      </w:ins>
-      <w:r>
-        <w:rPr>
-          <w:rFonts w:ascii="Garamond" w:hAnsi="Garamond"/>
-          <w:sz w:val="22"/>
-          <w:szCs w:val="22"/>
-        </w:rPr>
-        <w:t>smoothed timeseries data (n = 2,</w:t>
-      </w:r>
-      <w:commentRangeStart w:id="5"/>
-      <w:r>
-        <w:rPr>
-          <w:rFonts w:ascii="Garamond" w:hAnsi="Garamond"/>
-          <w:sz w:val="22"/>
-          <w:szCs w:val="22"/>
-        </w:rPr>
-        <w:t>531</w:t>
-      </w:r>
-      <w:ins w:id="6" w:author="Daniel Schindler" w:date="2025-10-25T09:35:00Z" w16du:dateUtc="2025-10-25T16:35:00Z">
-        <w:r>
-          <w:rPr>
-            <w:rFonts w:ascii="Garamond" w:hAnsi="Garamond"/>
-            <w:sz w:val="22"/>
-            <w:szCs w:val="22"/>
-          </w:rPr>
-          <w:t xml:space="preserve"> </w:t>
-        </w:r>
-      </w:ins>
-      <w:commentRangeEnd w:id="5"/>
-      <w:ins w:id="7" w:author="Daniel Schindler" w:date="2025-10-25T09:39:00Z" w16du:dateUtc="2025-10-25T16:39:00Z">
-        <w:r>
-          <w:rPr>
-            <w:rStyle w:val="CommentReference"/>
-          </w:rPr>
-          <w:commentReference w:id="5"/>
-        </w:r>
-      </w:ins>
-      <w:ins w:id="8" w:author="Daniel Schindler" w:date="2025-10-25T09:35:00Z" w16du:dateUtc="2025-10-25T16:35:00Z">
-        <w:r>
-          <w:rPr>
-            <w:rFonts w:ascii="Garamond" w:hAnsi="Garamond"/>
-            <w:sz w:val="22"/>
-            <w:szCs w:val="22"/>
-          </w:rPr>
-          <w:t>o</w:t>
-        </w:r>
-      </w:ins>
-      <w:ins w:id="9" w:author="Daniel Schindler" w:date="2025-10-25T09:36:00Z" w16du:dateUtc="2025-10-25T16:36:00Z">
-        <w:r>
-          <w:rPr>
-            <w:rFonts w:ascii="Garamond" w:hAnsi="Garamond"/>
-            <w:sz w:val="22"/>
-            <w:szCs w:val="22"/>
-          </w:rPr>
-          <w:t>toliths</w:t>
-        </w:r>
-      </w:ins>
-      <w:r>
-        <w:rPr>
-          <w:rFonts w:ascii="Garamond" w:hAnsi="Garamond"/>
-          <w:sz w:val="22"/>
-          <w:szCs w:val="22"/>
-        </w:rPr>
-        <w:t>). Significant clustering is evident, but with overlap between all watersheds. Yukon (Blue points) contain a much larger range of values</w:t>
-      </w:r>
-      <w:r>
-        <w:rPr>
-          <w:rFonts w:ascii="Garamond" w:hAnsi="Garamond"/>
-          <w:sz w:val="22"/>
-          <w:szCs w:val="22"/>
-        </w:rPr>
-        <w:t xml:space="preserve">, indicative of the large range in natal </w:t>
+        </w:rPr>
+        <w:t xml:space="preserve"> Principal Component analysis of GAM smoothed timeseries data (n = 2,</w:t>
+      </w:r>
+      <w:commentRangeStart w:id="2"/>
+      <w:r>
+        <w:rPr>
+          <w:rFonts w:ascii="Garamond" w:hAnsi="Garamond"/>
+        </w:rPr>
+        <w:t xml:space="preserve">531 </w:t>
+      </w:r>
+      <w:commentRangeEnd w:id="2"/>
+      <w:r>
+        <w:rPr>
+          <w:rStyle w:val="CommentReference"/>
+          <w:rFonts w:ascii="Garamond" w:hAnsi="Garamond"/>
+          <w:sz w:val="24"/>
+          <w:szCs w:val="24"/>
+        </w:rPr>
+        <w:commentReference w:id="2"/>
+      </w:r>
+      <w:r>
+        <w:rPr>
+          <w:rFonts w:ascii="Garamond" w:hAnsi="Garamond"/>
+        </w:rPr>
+        <w:t xml:space="preserve">otoliths). Significant clustering is evident, but with overlap between all watersheds. Yukon (Blue points) contain a much larger range of values, indicative of the large range in natal </w:t>
       </w:r>
       <w:r>
         <w:rPr>
           <w:rFonts w:ascii="Cambria Math" w:hAnsi="Cambria Math" w:cs="Cambria Math"/>
-          <w:sz w:val="22"/>
-          <w:szCs w:val="22"/>
         </w:rPr>
         <w:t>⁸⁷</w:t>
       </w:r>
       <w:r>
         <w:rPr>
           <w:rFonts w:ascii="Garamond" w:hAnsi="Garamond"/>
-          <w:sz w:val="22"/>
-          <w:szCs w:val="22"/>
         </w:rPr>
         <w:t>Sr/</w:t>
       </w:r>
       <w:r>
         <w:rPr>
           <w:rFonts w:ascii="Cambria Math" w:hAnsi="Cambria Math" w:cs="Cambria Math"/>
-          <w:sz w:val="22"/>
-          <w:szCs w:val="22"/>
         </w:rPr>
         <w:t>⁸⁶</w:t>
       </w:r>
       <w:r>
         <w:rPr>
           <w:rFonts w:ascii="Garamond" w:hAnsi="Garamond"/>
-          <w:sz w:val="22"/>
-          <w:szCs w:val="22"/>
-        </w:rPr>
-        <w:t xml:space="preserve">Sr </w:t>
-      </w:r>
-      <w:r>
-        <w:rPr>
-          <w:rFonts w:ascii="Garamond" w:hAnsi="Garamond"/>
-          <w:sz w:val="22"/>
-          <w:szCs w:val="22"/>
-        </w:rPr>
-        <w:t xml:space="preserve">values in the basin. Kuskokwim (Red points) overlap between both Nushagak and Yukon fish, likely due to its position in the region between both watersheds. </w:t>
-      </w:r>
-    </w:p>
-    <w:p>
-      <w:pPr>
-        <w:rPr>
-          <w:rFonts w:ascii="Garamond" w:hAnsi="Garamond"/>
+        </w:rPr>
+        <w:t xml:space="preserve">Sr values in the basin. Kuskokwim (Red points) overlap between both </w:t>
+      </w:r>
+      <w:proofErr w:type="spellStart"/>
+      <w:r>
+        <w:rPr>
+          <w:rFonts w:ascii="Garamond" w:hAnsi="Garamond"/>
+        </w:rPr>
+        <w:t>Nushagak</w:t>
+      </w:r>
+      <w:proofErr w:type="spellEnd"/>
+      <w:r>
+        <w:rPr>
+          <w:rFonts w:ascii="Garamond" w:hAnsi="Garamond"/>
+        </w:rPr>
+        <w:t xml:space="preserve"> and Yukon fish, likely due to its position in the region between both watersheds. </w:t>
+      </w:r>
+    </w:p>
+    <w:p>
+      <w:pPr>
+        <w:rPr>
+          <w:rFonts w:ascii="Garamond" w:hAnsi="Garamond"/>
+          <w:b/>
+          <w:bCs/>
           <w:sz w:val="16"/>
           <w:szCs w:val="16"/>
         </w:rPr>
@@ -1055,78 +537,8 @@
       <w:pPr>
         <w:rPr>
           <w:rFonts w:ascii="Garamond" w:hAnsi="Garamond"/>
-          <w:sz w:val="16"/>
-          <w:szCs w:val="16"/>
-        </w:rPr>
-      </w:pPr>
-    </w:p>
-    <w:p>
-      <w:pPr>
-        <w:rPr>
-          <w:rFonts w:ascii="Garamond" w:hAnsi="Garamond"/>
-          <w:sz w:val="16"/>
-          <w:szCs w:val="16"/>
-        </w:rPr>
-      </w:pPr>
-    </w:p>
-    <w:p>
-      <w:pPr>
-        <w:rPr>
-          <w:rFonts w:ascii="Garamond" w:hAnsi="Garamond"/>
-          <w:sz w:val="16"/>
-          <w:szCs w:val="16"/>
-        </w:rPr>
-      </w:pPr>
-    </w:p>
-    <w:p>
-      <w:pPr>
-        <w:rPr>
-          <w:rFonts w:ascii="Garamond" w:hAnsi="Garamond"/>
-          <w:sz w:val="16"/>
-          <w:szCs w:val="16"/>
-        </w:rPr>
-      </w:pPr>
-    </w:p>
-    <w:p>
-      <w:pPr>
-        <w:rPr>
-          <w:rFonts w:ascii="Garamond" w:hAnsi="Garamond"/>
-          <w:sz w:val="16"/>
-          <w:szCs w:val="16"/>
-        </w:rPr>
-      </w:pPr>
-    </w:p>
-    <w:p>
-      <w:pPr>
-        <w:rPr>
-          <w:rFonts w:ascii="Garamond" w:hAnsi="Garamond"/>
-          <w:sz w:val="16"/>
-          <w:szCs w:val="16"/>
-        </w:rPr>
-      </w:pPr>
-    </w:p>
-    <w:p>
-      <w:pPr>
-        <w:rPr>
-          <w:rFonts w:ascii="Garamond" w:hAnsi="Garamond"/>
-          <w:sz w:val="16"/>
-          <w:szCs w:val="16"/>
-        </w:rPr>
-      </w:pPr>
-    </w:p>
-    <w:p>
-      <w:pPr>
-        <w:rPr>
-          <w:rFonts w:ascii="Garamond" w:hAnsi="Garamond"/>
-          <w:sz w:val="16"/>
-          <w:szCs w:val="16"/>
-        </w:rPr>
-      </w:pPr>
-    </w:p>
-    <w:p>
-      <w:pPr>
-        <w:rPr>
-          <w:rFonts w:ascii="Garamond" w:hAnsi="Garamond"/>
+          <w:b/>
+          <w:bCs/>
           <w:sz w:val="16"/>
           <w:szCs w:val="16"/>
         </w:rPr>
@@ -1138,11 +550,12 @@
           <w:sz w:val="16"/>
           <w:szCs w:val="16"/>
         </w:rPr>
+        <w:lastRenderedPageBreak/>
         <w:drawing>
-          <wp:inline distT="0" distB="0" distL="0" distR="0" wp14:anchorId="6BCD3F3F" wp14:editId="7EB9A63C">
-            <wp:extent cx="6409834" cy="3273398"/>
-            <wp:effectExtent l="0" t="0" r="3810" b="3810"/>
-            <wp:docPr id="219536095" name="Picture 2" descr="A group of graphs showing different types of data&#10;&#10;AI-generated content may be incorrect."/>
+          <wp:inline distT="0" distB="0" distL="0" distR="0" wp14:anchorId="2872C2BB" wp14:editId="5A83A858">
+            <wp:extent cx="5943600" cy="3034665"/>
+            <wp:effectExtent l="0" t="0" r="0" b="635"/>
+            <wp:docPr id="1067725208" name="Picture 2" descr="A group of graphs showing different types of data&#10;&#10;AI-generated content may be incorrect."/>
             <wp:cNvGraphicFramePr>
               <a:graphicFrameLocks xmlns:a="http://schemas.openxmlformats.org/drawingml/2006/main" noChangeAspect="1"/>
             </wp:cNvGraphicFramePr>
@@ -1154,7 +567,7 @@
                     <pic:cNvPicPr/>
                   </pic:nvPicPr>
                   <pic:blipFill>
-                    <a:blip r:embed="rId13" cstate="print">
+                    <a:blip r:embed="rId11" cstate="print">
                       <a:extLst>
                         <a:ext uri="{28A0092B-C50C-407E-A947-70E740481C1C}">
                           <a14:useLocalDpi xmlns:a14="http://schemas.microsoft.com/office/drawing/2010/main" val="0"/>
@@ -1168,7 +581,7 @@
                   <pic:spPr>
                     <a:xfrm>
                       <a:off x="0" y="0"/>
-                      <a:ext cx="6438129" cy="3287848"/>
+                      <a:ext cx="5943600" cy="3034665"/>
                     </a:xfrm>
                     <a:prstGeom prst="rect">
                       <a:avLst/>
@@ -1185,26 +598,13 @@
       <w:pPr>
         <w:rPr>
           <w:rFonts w:ascii="Garamond" w:hAnsi="Garamond"/>
-          <w:sz w:val="16"/>
-          <w:szCs w:val="16"/>
-        </w:rPr>
-      </w:pPr>
-    </w:p>
-    <w:p>
-      <w:pPr>
-        <w:rPr>
-          <w:rFonts w:ascii="Garamond" w:hAnsi="Garamond"/>
-          <w:sz w:val="22"/>
-          <w:szCs w:val="22"/>
-        </w:rPr>
-      </w:pPr>
-      <w:r>
-        <w:rPr>
-          <w:rFonts w:ascii="Garamond" w:hAnsi="Garamond"/>
-          <w:b/>
-          <w:bCs/>
-          <w:sz w:val="22"/>
-          <w:szCs w:val="22"/>
+        </w:rPr>
+      </w:pPr>
+      <w:r>
+        <w:rPr>
+          <w:rFonts w:ascii="Garamond" w:hAnsi="Garamond"/>
+          <w:b/>
+          <w:bCs/>
         </w:rPr>
         <w:t xml:space="preserve">Figure </w:t>
       </w:r>
@@ -1213,292 +613,103 @@
           <w:rFonts w:ascii="Garamond" w:hAnsi="Garamond"/>
           <w:b/>
           <w:bCs/>
-          <w:sz w:val="22"/>
-          <w:szCs w:val="22"/>
-        </w:rPr>
-        <w:t>5</w:t>
-      </w:r>
-      <w:r>
-        <w:rPr>
-          <w:rFonts w:ascii="Garamond" w:hAnsi="Garamond"/>
-          <w:b/>
-          <w:bCs/>
-          <w:sz w:val="22"/>
-          <w:szCs w:val="22"/>
-        </w:rPr>
-        <w:t>:</w:t>
-      </w:r>
-      <w:r>
-        <w:rPr>
-          <w:rFonts w:ascii="Garamond" w:hAnsi="Garamond"/>
-          <w:b/>
-          <w:bCs/>
-          <w:sz w:val="22"/>
-          <w:szCs w:val="22"/>
-        </w:rPr>
-        <w:t xml:space="preserve"> </w:t>
-      </w:r>
-      <w:r>
-        <w:rPr>
-          <w:rFonts w:ascii="Garamond" w:hAnsi="Garamond"/>
-          <w:sz w:val="22"/>
-          <w:szCs w:val="22"/>
-        </w:rPr>
-        <w:t>A)</w:t>
-      </w:r>
-      <w:r>
-        <w:rPr>
-          <w:rFonts w:ascii="Garamond" w:hAnsi="Garamond"/>
-          <w:sz w:val="22"/>
-          <w:szCs w:val="22"/>
-        </w:rPr>
-        <w:t xml:space="preserve"> Principal component analysis of all samples with a natal origin </w:t>
+        </w:rPr>
+        <w:t>3</w:t>
+      </w:r>
+      <w:r>
+        <w:rPr>
+          <w:rFonts w:ascii="Garamond" w:hAnsi="Garamond"/>
+          <w:b/>
+          <w:bCs/>
+        </w:rPr>
+        <w:t xml:space="preserve">: </w:t>
+      </w:r>
+      <w:r>
+        <w:rPr>
+          <w:rFonts w:ascii="Garamond" w:hAnsi="Garamond"/>
+        </w:rPr>
+        <w:t xml:space="preserve">A) Principal component analysis of all samples with a natal origin </w:t>
       </w:r>
       <w:r>
         <w:rPr>
           <w:rFonts w:ascii="Cambria Math" w:hAnsi="Cambria Math" w:cs="Cambria Math"/>
-          <w:sz w:val="22"/>
-          <w:szCs w:val="22"/>
         </w:rPr>
         <w:t>⁸⁷</w:t>
       </w:r>
       <w:r>
         <w:rPr>
           <w:rFonts w:ascii="Garamond" w:hAnsi="Garamond"/>
-          <w:sz w:val="22"/>
-          <w:szCs w:val="22"/>
         </w:rPr>
         <w:t>Sr/</w:t>
       </w:r>
       <w:r>
         <w:rPr>
           <w:rFonts w:ascii="Cambria Math" w:hAnsi="Cambria Math" w:cs="Cambria Math"/>
-          <w:sz w:val="22"/>
-          <w:szCs w:val="22"/>
         </w:rPr>
         <w:t>⁸⁶</w:t>
       </w:r>
       <w:r>
         <w:rPr>
           <w:rFonts w:ascii="Garamond" w:hAnsi="Garamond"/>
-          <w:sz w:val="22"/>
-          <w:szCs w:val="22"/>
-        </w:rPr>
-        <w:t>Sr</w:t>
-      </w:r>
-      <w:r>
-        <w:rPr>
-          <w:rFonts w:ascii="Garamond" w:hAnsi="Garamond"/>
-          <w:sz w:val="22"/>
-          <w:szCs w:val="22"/>
-        </w:rPr>
-        <w:t xml:space="preserve"> of 0.708</w:t>
-      </w:r>
-      <w:r>
-        <w:rPr>
-          <w:rFonts w:ascii="Garamond" w:hAnsi="Garamond"/>
-          <w:sz w:val="22"/>
-          <w:szCs w:val="22"/>
-        </w:rPr>
-        <w:t xml:space="preserve">0 </w:t>
-      </w:r>
-      <w:r>
-        <w:rPr>
-          <w:rFonts w:ascii="Garamond" w:hAnsi="Garamond"/>
-          <w:sz w:val="22"/>
-          <w:szCs w:val="22"/>
-        </w:rPr>
-        <w:t>- 0.</w:t>
-      </w:r>
-      <w:r>
-        <w:rPr>
-          <w:rFonts w:ascii="Garamond" w:hAnsi="Garamond"/>
-          <w:sz w:val="22"/>
-          <w:szCs w:val="22"/>
-        </w:rPr>
-        <w:t xml:space="preserve">7085. Clustering among watersheds is evident between principal </w:t>
-      </w:r>
-      <w:commentRangeStart w:id="10"/>
-      <w:commentRangeStart w:id="11"/>
-      <w:r>
-        <w:rPr>
-          <w:rFonts w:ascii="Garamond" w:hAnsi="Garamond"/>
-          <w:sz w:val="22"/>
-          <w:szCs w:val="22"/>
+        </w:rPr>
+        <w:t xml:space="preserve">Sr of 0.7080 - 0.7085. Clustering among watersheds is evident between principal </w:t>
+      </w:r>
+      <w:commentRangeStart w:id="3"/>
+      <w:commentRangeStart w:id="4"/>
+      <w:r>
+        <w:rPr>
+          <w:rFonts w:ascii="Garamond" w:hAnsi="Garamond"/>
         </w:rPr>
         <w:t>components</w:t>
       </w:r>
-      <w:commentRangeEnd w:id="10"/>
+      <w:commentRangeEnd w:id="3"/>
       <w:r>
         <w:rPr>
           <w:rStyle w:val="CommentReference"/>
           <w:rFonts w:ascii="Garamond" w:hAnsi="Garamond"/>
-          <w:sz w:val="22"/>
-          <w:szCs w:val="22"/>
-        </w:rPr>
-        <w:commentReference w:id="10"/>
-      </w:r>
-      <w:commentRangeEnd w:id="11"/>
+          <w:sz w:val="24"/>
+          <w:szCs w:val="24"/>
+        </w:rPr>
+        <w:commentReference w:id="3"/>
+      </w:r>
+      <w:commentRangeEnd w:id="4"/>
       <w:r>
         <w:rPr>
           <w:rStyle w:val="CommentReference"/>
           <w:rFonts w:ascii="Garamond" w:hAnsi="Garamond"/>
-          <w:sz w:val="22"/>
-          <w:szCs w:val="22"/>
-        </w:rPr>
-        <w:commentReference w:id="11"/>
-      </w:r>
-      <w:r>
-        <w:rPr>
-          <w:rFonts w:ascii="Garamond" w:hAnsi="Garamond"/>
-          <w:sz w:val="22"/>
-          <w:szCs w:val="22"/>
-        </w:rPr>
-        <w:t xml:space="preserve"> 1 and 2 (</w:t>
-      </w:r>
-      <w:r>
-        <w:rPr>
-          <w:rFonts w:ascii="Garamond" w:hAnsi="Garamond"/>
-          <w:sz w:val="22"/>
-          <w:szCs w:val="22"/>
-        </w:rPr>
-        <w:t>68.39</w:t>
-      </w:r>
-      <w:r>
-        <w:rPr>
-          <w:rFonts w:ascii="Garamond" w:hAnsi="Garamond"/>
-          <w:sz w:val="22"/>
-          <w:szCs w:val="22"/>
-        </w:rPr>
-        <w:t>% of variance), as well as between principal components 2 and 3 (</w:t>
-      </w:r>
-      <w:r>
-        <w:rPr>
-          <w:rFonts w:ascii="Garamond" w:hAnsi="Garamond"/>
-          <w:sz w:val="22"/>
-          <w:szCs w:val="22"/>
-        </w:rPr>
-        <w:t>31.16%</w:t>
-      </w:r>
-      <w:r>
-        <w:rPr>
-          <w:rFonts w:ascii="Garamond" w:hAnsi="Garamond"/>
-          <w:sz w:val="22"/>
-          <w:szCs w:val="22"/>
-        </w:rPr>
-        <w:t xml:space="preserve"> </w:t>
-      </w:r>
-      <w:r>
-        <w:rPr>
-          <w:rFonts w:ascii="Garamond" w:hAnsi="Garamond"/>
-          <w:sz w:val="22"/>
-          <w:szCs w:val="22"/>
-        </w:rPr>
-        <w:t xml:space="preserve">of </w:t>
-      </w:r>
-      <w:r>
-        <w:rPr>
-          <w:rFonts w:ascii="Garamond" w:hAnsi="Garamond"/>
-          <w:sz w:val="22"/>
-          <w:szCs w:val="22"/>
-        </w:rPr>
-        <w:t xml:space="preserve">variance). There is </w:t>
-      </w:r>
-      <w:r>
-        <w:rPr>
-          <w:rFonts w:ascii="Garamond" w:hAnsi="Garamond"/>
-          <w:sz w:val="22"/>
-          <w:szCs w:val="22"/>
-        </w:rPr>
-        <w:t>s</w:t>
-      </w:r>
-      <w:r>
-        <w:rPr>
-          <w:rFonts w:ascii="Garamond" w:hAnsi="Garamond"/>
-          <w:sz w:val="22"/>
-          <w:szCs w:val="22"/>
-        </w:rPr>
-        <w:t xml:space="preserve">ome overlap between all three watersheds in both cases. B) </w:t>
-      </w:r>
-      <w:commentRangeStart w:id="12"/>
-      <w:r>
-        <w:rPr>
-          <w:rFonts w:ascii="Garamond" w:hAnsi="Garamond"/>
-          <w:sz w:val="22"/>
-          <w:szCs w:val="22"/>
+          <w:sz w:val="24"/>
+          <w:szCs w:val="24"/>
+        </w:rPr>
+        <w:commentReference w:id="4"/>
+      </w:r>
+      <w:r>
+        <w:rPr>
+          <w:rFonts w:ascii="Garamond" w:hAnsi="Garamond"/>
+        </w:rPr>
+        <w:t xml:space="preserve"> 1 and 2 (68.39% of variance), as well as between principal components 2 and 3 (31.16% of variance). There is some overlap between all three watersheds in both cases. B) </w:t>
+      </w:r>
+      <w:commentRangeStart w:id="5"/>
+      <w:r>
+        <w:rPr>
+          <w:rFonts w:ascii="Garamond" w:hAnsi="Garamond"/>
         </w:rPr>
         <w:t xml:space="preserve">Sample </w:t>
       </w:r>
-      <w:commentRangeEnd w:id="12"/>
+      <w:commentRangeEnd w:id="5"/>
       <w:r>
         <w:rPr>
           <w:rStyle w:val="CommentReference"/>
-        </w:rPr>
-        <w:commentReference w:id="12"/>
-      </w:r>
-      <w:r>
-        <w:rPr>
-          <w:rFonts w:ascii="Garamond" w:hAnsi="Garamond"/>
-          <w:sz w:val="22"/>
-          <w:szCs w:val="22"/>
-        </w:rPr>
-        <w:t>otolith LA timeseries colored by the absolute value of the PCA loadings at associated</w:t>
-      </w:r>
-      <w:r>
-        <w:rPr>
-          <w:rFonts w:ascii="Garamond" w:hAnsi="Garamond"/>
-          <w:sz w:val="22"/>
-          <w:szCs w:val="22"/>
-        </w:rPr>
-        <w:t xml:space="preserve"> timeseries</w:t>
-      </w:r>
-      <w:r>
-        <w:rPr>
-          <w:rFonts w:ascii="Garamond" w:hAnsi="Garamond"/>
-          <w:sz w:val="22"/>
-          <w:szCs w:val="22"/>
-        </w:rPr>
-        <w:t xml:space="preserve"> indices. PC1 (top row) shows high loading on the middle section of the timeseries after the natal origin region. PC2 is driven by the region of the timeseries towards the marine entry</w:t>
-      </w:r>
-      <w:r>
-        <w:rPr>
-          <w:rFonts w:ascii="Garamond" w:hAnsi="Garamond"/>
-          <w:sz w:val="22"/>
-          <w:szCs w:val="22"/>
-        </w:rPr>
-        <w:t xml:space="preserve">, likely the result of mainstem migration to the ocean. </w:t>
-      </w:r>
-      <w:r>
-        <w:rPr>
-          <w:rFonts w:ascii="Garamond" w:hAnsi="Garamond"/>
-          <w:sz w:val="22"/>
-          <w:szCs w:val="22"/>
-        </w:rPr>
-        <w:t xml:space="preserve">Separation along </w:t>
-      </w:r>
-      <w:r>
-        <w:rPr>
-          <w:rFonts w:ascii="Garamond" w:hAnsi="Garamond"/>
-          <w:sz w:val="22"/>
-          <w:szCs w:val="22"/>
-        </w:rPr>
-        <w:t xml:space="preserve">PC3 is driven by the very beginning of the timeseries, which is the region associated with the natal origin. </w:t>
-      </w:r>
-      <w:r>
-        <w:rPr>
-          <w:rFonts w:ascii="Garamond" w:hAnsi="Garamond"/>
-          <w:sz w:val="22"/>
-          <w:szCs w:val="22"/>
-        </w:rPr>
-        <w:t xml:space="preserve">Notably, </w:t>
-      </w:r>
-      <w:r>
-        <w:rPr>
-          <w:rFonts w:ascii="Garamond" w:hAnsi="Garamond"/>
-          <w:sz w:val="22"/>
-          <w:szCs w:val="22"/>
-        </w:rPr>
-        <w:t>Yukon individuals from the CWAK region contain a less pronounces mainstem signal as compared to their counterpart from the upper or middle Yukon genetic groups.</w:t>
+          <w:rFonts w:ascii="Garamond" w:hAnsi="Garamond"/>
+          <w:sz w:val="24"/>
+          <w:szCs w:val="24"/>
+        </w:rPr>
+        <w:commentReference w:id="5"/>
+      </w:r>
+      <w:r>
+        <w:rPr>
+          <w:rFonts w:ascii="Garamond" w:hAnsi="Garamond"/>
+        </w:rPr>
+        <w:t>otolith LA timeseries colored by the absolute value of the PCA loadings at associated timeseries indices. PC1 (top row) shows high loading on the middle section of the timeseries after the natal origin region. PC2 is driven by the region of the timeseries towards the marine entry, likely the result of mainstem migration to the ocean. Separation along PC3 is driven by the very beginning of the timeseries, which is the region associated with the natal origin. Notably, Yukon individuals from the CWAK region contain a less pronounces mainstem signal as compared to their counterpart from the upper or middle Yukon genetic groups.</w:t>
       </w:r>
     </w:p>
     <w:p>
@@ -1587,6 +798,490 @@
           <w:szCs w:val="16"/>
         </w:rPr>
         <w:lastRenderedPageBreak/>
+        <w:drawing>
+          <wp:inline distT="0" distB="0" distL="0" distR="0" wp14:anchorId="0EE2AE9C" wp14:editId="060AFD3D">
+            <wp:extent cx="5943600" cy="2054225"/>
+            <wp:effectExtent l="0" t="0" r="0" b="3175"/>
+            <wp:docPr id="887724946" name="Picture 1" descr="A close-up of a graph&#10;&#10;AI-generated content may be incorrect."/>
+            <wp:cNvGraphicFramePr>
+              <a:graphicFrameLocks xmlns:a="http://schemas.openxmlformats.org/drawingml/2006/main" noChangeAspect="1"/>
+            </wp:cNvGraphicFramePr>
+            <a:graphic xmlns:a="http://schemas.openxmlformats.org/drawingml/2006/main">
+              <a:graphicData uri="http://schemas.openxmlformats.org/drawingml/2006/picture">
+                <pic:pic xmlns:pic="http://schemas.openxmlformats.org/drawingml/2006/picture">
+                  <pic:nvPicPr>
+                    <pic:cNvPr id="887724946" name="Picture 1" descr="A close-up of a graph&#10;&#10;AI-generated content may be incorrect."/>
+                    <pic:cNvPicPr/>
+                  </pic:nvPicPr>
+                  <pic:blipFill>
+                    <a:blip r:embed="rId12"/>
+                    <a:stretch>
+                      <a:fillRect/>
+                    </a:stretch>
+                  </pic:blipFill>
+                  <pic:spPr>
+                    <a:xfrm>
+                      <a:off x="0" y="0"/>
+                      <a:ext cx="5943600" cy="2054225"/>
+                    </a:xfrm>
+                    <a:prstGeom prst="rect">
+                      <a:avLst/>
+                    </a:prstGeom>
+                  </pic:spPr>
+                </pic:pic>
+              </a:graphicData>
+            </a:graphic>
+          </wp:inline>
+        </w:drawing>
+      </w:r>
+    </w:p>
+    <w:p>
+      <w:pPr>
+        <w:rPr>
+          <w:rFonts w:ascii="Garamond" w:hAnsi="Garamond"/>
+          <w:sz w:val="16"/>
+          <w:szCs w:val="16"/>
+        </w:rPr>
+      </w:pPr>
+      <w:r>
+        <w:rPr>
+          <w:rFonts w:ascii="Garamond" w:hAnsi="Garamond"/>
+          <w:b/>
+          <w:bCs/>
+          <w:sz w:val="22"/>
+          <w:szCs w:val="22"/>
+        </w:rPr>
+        <w:t xml:space="preserve">Figure </w:t>
+      </w:r>
+      <w:r>
+        <w:rPr>
+          <w:rFonts w:ascii="Garamond" w:hAnsi="Garamond"/>
+          <w:b/>
+          <w:bCs/>
+          <w:sz w:val="22"/>
+          <w:szCs w:val="22"/>
+        </w:rPr>
+        <w:t>4</w:t>
+      </w:r>
+      <w:r>
+        <w:rPr>
+          <w:rFonts w:ascii="Garamond" w:hAnsi="Garamond"/>
+          <w:b/>
+          <w:bCs/>
+          <w:sz w:val="22"/>
+          <w:szCs w:val="22"/>
+        </w:rPr>
+        <w:t>:</w:t>
+      </w:r>
+      <w:r>
+        <w:rPr>
+          <w:rFonts w:ascii="Garamond" w:hAnsi="Garamond"/>
+          <w:sz w:val="16"/>
+          <w:szCs w:val="16"/>
+        </w:rPr>
+        <w:t xml:space="preserve"> </w:t>
+      </w:r>
+      <w:r>
+        <w:rPr>
+          <w:rFonts w:ascii="Garamond" w:hAnsi="Garamond"/>
+          <w:sz w:val="22"/>
+          <w:szCs w:val="22"/>
+        </w:rPr>
+        <w:t xml:space="preserve">Model Performance comparison among data </w:t>
+      </w:r>
+      <w:r>
+        <w:rPr>
+          <w:rFonts w:ascii="Garamond" w:hAnsi="Garamond"/>
+          <w:sz w:val="22"/>
+          <w:szCs w:val="22"/>
+        </w:rPr>
+        <w:t xml:space="preserve">preprocessing steps </w:t>
+      </w:r>
+      <w:r>
+        <w:rPr>
+          <w:rFonts w:ascii="Garamond" w:hAnsi="Garamond"/>
+          <w:sz w:val="22"/>
+          <w:szCs w:val="22"/>
+        </w:rPr>
+        <w:t xml:space="preserve">and model types. Accuracy indicates the proportion of each class correctly classified. F1-Score is the harmonic mean of precision and recall, providing a balanced performance measure across all watershed classes. Results compare </w:t>
+      </w:r>
+      <w:r>
+        <w:rPr>
+          <w:rFonts w:ascii="Garamond" w:hAnsi="Garamond"/>
+          <w:sz w:val="22"/>
+          <w:szCs w:val="22"/>
+        </w:rPr>
+        <w:t>two</w:t>
+      </w:r>
+      <w:r>
+        <w:rPr>
+          <w:rFonts w:ascii="Garamond" w:hAnsi="Garamond"/>
+          <w:sz w:val="22"/>
+          <w:szCs w:val="22"/>
+        </w:rPr>
+        <w:t xml:space="preserve"> </w:t>
+      </w:r>
+      <w:r>
+        <w:rPr>
+          <w:rFonts w:ascii="Cambria Math" w:hAnsi="Cambria Math" w:cs="Cambria Math"/>
+          <w:sz w:val="22"/>
+          <w:szCs w:val="22"/>
+        </w:rPr>
+        <w:t>⁸⁷</w:t>
+      </w:r>
+      <w:r>
+        <w:rPr>
+          <w:rFonts w:ascii="Garamond" w:hAnsi="Garamond"/>
+          <w:sz w:val="22"/>
+          <w:szCs w:val="22"/>
+        </w:rPr>
+        <w:t>Sr/</w:t>
+      </w:r>
+      <w:r>
+        <w:rPr>
+          <w:rFonts w:ascii="Cambria Math" w:hAnsi="Cambria Math" w:cs="Cambria Math"/>
+          <w:sz w:val="22"/>
+          <w:szCs w:val="22"/>
+        </w:rPr>
+        <w:t>⁸⁶</w:t>
+      </w:r>
+      <w:r>
+        <w:rPr>
+          <w:rFonts w:ascii="Garamond" w:hAnsi="Garamond"/>
+          <w:sz w:val="22"/>
+          <w:szCs w:val="22"/>
+        </w:rPr>
+        <w:t xml:space="preserve">Sr </w:t>
+      </w:r>
+      <w:r>
+        <w:rPr>
+          <w:rFonts w:ascii="Garamond" w:hAnsi="Garamond"/>
+          <w:sz w:val="22"/>
+          <w:szCs w:val="22"/>
+        </w:rPr>
+        <w:t xml:space="preserve">timeseries smoothing </w:t>
+      </w:r>
+      <w:r>
+        <w:rPr>
+          <w:rFonts w:ascii="Garamond" w:hAnsi="Garamond"/>
+          <w:sz w:val="22"/>
+          <w:szCs w:val="22"/>
+        </w:rPr>
+        <w:t xml:space="preserve">methods (GAM, MA) </w:t>
+      </w:r>
+      <w:r>
+        <w:rPr>
+          <w:rFonts w:ascii="Garamond" w:hAnsi="Garamond"/>
+          <w:sz w:val="22"/>
+          <w:szCs w:val="22"/>
+        </w:rPr>
+        <w:t>a</w:t>
+      </w:r>
+      <w:r>
+        <w:rPr>
+          <w:rFonts w:ascii="Garamond" w:hAnsi="Garamond"/>
+          <w:sz w:val="22"/>
+          <w:szCs w:val="22"/>
+        </w:rPr>
+        <w:t xml:space="preserve">nd three machine learning algorithms (Random Forest, SVM, KNN) using either all test data (Total) or only overlapping isotope ranges (Overlapping). </w:t>
+      </w:r>
+      <w:r>
+        <w:rPr>
+          <w:rFonts w:ascii="Garamond" w:hAnsi="Garamond"/>
+          <w:sz w:val="22"/>
+          <w:szCs w:val="22"/>
+        </w:rPr>
+        <w:t>Darker green colors indicate higher scores</w:t>
+      </w:r>
+      <w:r>
+        <w:rPr>
+          <w:rFonts w:ascii="Garamond" w:hAnsi="Garamond"/>
+          <w:sz w:val="16"/>
+          <w:szCs w:val="16"/>
+        </w:rPr>
+        <w:t>.</w:t>
+      </w:r>
+    </w:p>
+    <w:p>
+      <w:pPr>
+        <w:rPr>
+          <w:rFonts w:ascii="Garamond" w:hAnsi="Garamond"/>
+          <w:sz w:val="16"/>
+          <w:szCs w:val="16"/>
+        </w:rPr>
+      </w:pPr>
+    </w:p>
+    <w:p>
+      <w:pPr>
+        <w:rPr>
+          <w:rFonts w:ascii="Garamond" w:hAnsi="Garamond"/>
+          <w:sz w:val="16"/>
+          <w:szCs w:val="16"/>
+        </w:rPr>
+      </w:pPr>
+      <w:r>
+        <w:rPr>
+          <w:rFonts w:ascii="Garamond" w:hAnsi="Garamond"/>
+          <w:noProof/>
+          <w:sz w:val="16"/>
+          <w:szCs w:val="16"/>
+        </w:rPr>
+        <w:drawing>
+          <wp:inline distT="0" distB="0" distL="0" distR="0" wp14:anchorId="16679699" wp14:editId="668105C7">
+            <wp:extent cx="5962810" cy="2981405"/>
+            <wp:effectExtent l="0" t="0" r="6350" b="3175"/>
+            <wp:docPr id="1789130704" name="Picture 6"/>
+            <wp:cNvGraphicFramePr>
+              <a:graphicFrameLocks xmlns:a="http://schemas.openxmlformats.org/drawingml/2006/main" noChangeAspect="1"/>
+            </wp:cNvGraphicFramePr>
+            <a:graphic xmlns:a="http://schemas.openxmlformats.org/drawingml/2006/main">
+              <a:graphicData uri="http://schemas.openxmlformats.org/drawingml/2006/picture">
+                <pic:pic xmlns:pic="http://schemas.openxmlformats.org/drawingml/2006/picture">
+                  <pic:nvPicPr>
+                    <pic:cNvPr id="1789130704" name="Picture 1789130704"/>
+                    <pic:cNvPicPr/>
+                  </pic:nvPicPr>
+                  <pic:blipFill>
+                    <a:blip r:embed="rId13"/>
+                    <a:stretch>
+                      <a:fillRect/>
+                    </a:stretch>
+                  </pic:blipFill>
+                  <pic:spPr>
+                    <a:xfrm>
+                      <a:off x="0" y="0"/>
+                      <a:ext cx="5988578" cy="2994289"/>
+                    </a:xfrm>
+                    <a:prstGeom prst="rect">
+                      <a:avLst/>
+                    </a:prstGeom>
+                  </pic:spPr>
+                </pic:pic>
+              </a:graphicData>
+            </a:graphic>
+          </wp:inline>
+        </w:drawing>
+      </w:r>
+      <w:r>
+        <w:rPr>
+          <w:rFonts w:ascii="Garamond" w:hAnsi="Garamond"/>
+          <w:sz w:val="16"/>
+          <w:szCs w:val="16"/>
+        </w:rPr>
+        <w:t xml:space="preserve"> </w:t>
+      </w:r>
+    </w:p>
+    <w:p>
+      <w:pPr>
+        <w:rPr>
+          <w:rFonts w:ascii="Garamond" w:hAnsi="Garamond"/>
+          <w:sz w:val="22"/>
+          <w:szCs w:val="22"/>
+        </w:rPr>
+      </w:pPr>
+      <w:r>
+        <w:rPr>
+          <w:rFonts w:ascii="Garamond" w:hAnsi="Garamond"/>
+          <w:b/>
+          <w:bCs/>
+          <w:sz w:val="22"/>
+          <w:szCs w:val="22"/>
+        </w:rPr>
+        <w:t xml:space="preserve">Figure </w:t>
+      </w:r>
+      <w:r>
+        <w:rPr>
+          <w:rFonts w:ascii="Garamond" w:hAnsi="Garamond"/>
+          <w:b/>
+          <w:bCs/>
+          <w:sz w:val="22"/>
+          <w:szCs w:val="22"/>
+        </w:rPr>
+        <w:t>5</w:t>
+      </w:r>
+      <w:r>
+        <w:rPr>
+          <w:rFonts w:ascii="Garamond" w:hAnsi="Garamond"/>
+          <w:b/>
+          <w:bCs/>
+          <w:sz w:val="22"/>
+          <w:szCs w:val="22"/>
+        </w:rPr>
+        <w:t>:</w:t>
+      </w:r>
+      <w:r>
+        <w:rPr>
+          <w:rFonts w:ascii="Garamond" w:hAnsi="Garamond"/>
+          <w:sz w:val="22"/>
+          <w:szCs w:val="22"/>
+        </w:rPr>
+        <w:t xml:space="preserve"> </w:t>
+      </w:r>
+      <w:commentRangeStart w:id="6"/>
+      <w:r>
+        <w:rPr>
+          <w:rFonts w:ascii="Garamond" w:hAnsi="Garamond"/>
+          <w:sz w:val="22"/>
+          <w:szCs w:val="22"/>
+        </w:rPr>
+        <w:t>Confusion</w:t>
+      </w:r>
+      <w:commentRangeEnd w:id="6"/>
+      <w:r>
+        <w:rPr>
+          <w:rStyle w:val="CommentReference"/>
+        </w:rPr>
+        <w:commentReference w:id="6"/>
+      </w:r>
+      <w:r>
+        <w:rPr>
+          <w:rFonts w:ascii="Garamond" w:hAnsi="Garamond"/>
+          <w:sz w:val="22"/>
+          <w:szCs w:val="22"/>
+        </w:rPr>
+        <w:t xml:space="preserve"> matrix from the highest p</w:t>
+      </w:r>
+      <w:r>
+        <w:rPr>
+          <w:rFonts w:ascii="Garamond" w:hAnsi="Garamond"/>
+          <w:sz w:val="22"/>
+          <w:szCs w:val="22"/>
+        </w:rPr>
+        <w:t>er</w:t>
+      </w:r>
+      <w:r>
+        <w:rPr>
+          <w:rFonts w:ascii="Garamond" w:hAnsi="Garamond"/>
+          <w:sz w:val="22"/>
+          <w:szCs w:val="22"/>
+        </w:rPr>
+        <w:t xml:space="preserve">forming model (Random Forest on GAM Smoothed data) for both total </w:t>
+      </w:r>
+      <w:proofErr w:type="gramStart"/>
+      <w:r>
+        <w:rPr>
+          <w:rFonts w:ascii="Garamond" w:hAnsi="Garamond"/>
+          <w:sz w:val="22"/>
+          <w:szCs w:val="22"/>
+        </w:rPr>
+        <w:t>test</w:t>
+      </w:r>
+      <w:proofErr w:type="gramEnd"/>
+      <w:r>
+        <w:rPr>
+          <w:rFonts w:ascii="Garamond" w:hAnsi="Garamond"/>
+          <w:sz w:val="22"/>
+          <w:szCs w:val="22"/>
+        </w:rPr>
+        <w:t xml:space="preserve"> set and overlapping subset. Boxes along the horizontal axis indicate correctly classified individuals</w:t>
+      </w:r>
+      <w:r>
+        <w:rPr>
+          <w:rFonts w:ascii="Garamond" w:hAnsi="Garamond"/>
+          <w:sz w:val="22"/>
+          <w:szCs w:val="22"/>
+        </w:rPr>
+        <w:t xml:space="preserve"> (red). Vertical axis labels are the actual watershed labels whereas horizontal labels are the predicted class from the model. Percentage</w:t>
+      </w:r>
+      <w:r>
+        <w:rPr>
+          <w:rFonts w:ascii="Garamond" w:hAnsi="Garamond"/>
+          <w:sz w:val="22"/>
+          <w:szCs w:val="22"/>
+        </w:rPr>
+        <w:t>s indicate</w:t>
+      </w:r>
+      <w:r>
+        <w:rPr>
+          <w:rFonts w:ascii="Garamond" w:hAnsi="Garamond"/>
+          <w:sz w:val="22"/>
+          <w:szCs w:val="22"/>
+        </w:rPr>
+        <w:t xml:space="preserve"> the percent of the actual class identified as the predicted class. </w:t>
+      </w:r>
+      <w:r>
+        <w:rPr>
+          <w:rFonts w:ascii="Garamond" w:hAnsi="Garamond"/>
+          <w:sz w:val="22"/>
+          <w:szCs w:val="22"/>
+        </w:rPr>
+        <w:t xml:space="preserve">  </w:t>
+      </w:r>
+    </w:p>
+    <w:p>
+      <w:pPr>
+        <w:rPr>
+          <w:rFonts w:ascii="Garamond" w:hAnsi="Garamond"/>
+          <w:b/>
+          <w:bCs/>
+          <w:sz w:val="16"/>
+          <w:szCs w:val="16"/>
+        </w:rPr>
+      </w:pPr>
+    </w:p>
+    <w:p>
+      <w:pPr>
+        <w:rPr>
+          <w:rFonts w:ascii="Garamond" w:hAnsi="Garamond"/>
+          <w:b/>
+          <w:bCs/>
+          <w:sz w:val="16"/>
+          <w:szCs w:val="16"/>
+        </w:rPr>
+      </w:pPr>
+    </w:p>
+    <w:p>
+      <w:pPr>
+        <w:rPr>
+          <w:rFonts w:ascii="Garamond" w:hAnsi="Garamond"/>
+          <w:b/>
+          <w:bCs/>
+          <w:sz w:val="16"/>
+          <w:szCs w:val="16"/>
+        </w:rPr>
+      </w:pPr>
+    </w:p>
+    <w:p>
+      <w:pPr>
+        <w:rPr>
+          <w:rFonts w:ascii="Garamond" w:hAnsi="Garamond"/>
+          <w:b/>
+          <w:bCs/>
+          <w:sz w:val="16"/>
+          <w:szCs w:val="16"/>
+        </w:rPr>
+      </w:pPr>
+    </w:p>
+    <w:p>
+      <w:pPr>
+        <w:rPr>
+          <w:rFonts w:ascii="Garamond" w:hAnsi="Garamond"/>
+          <w:b/>
+          <w:bCs/>
+          <w:sz w:val="16"/>
+          <w:szCs w:val="16"/>
+        </w:rPr>
+      </w:pPr>
+    </w:p>
+    <w:p>
+      <w:pPr>
+        <w:rPr>
+          <w:rFonts w:ascii="Garamond" w:hAnsi="Garamond"/>
+          <w:b/>
+          <w:bCs/>
+          <w:sz w:val="16"/>
+          <w:szCs w:val="16"/>
+        </w:rPr>
+      </w:pPr>
+      <w:r>
+        <w:rPr>
+          <w:rFonts w:ascii="Garamond" w:hAnsi="Garamond"/>
+          <w:b/>
+          <w:bCs/>
+          <w:noProof/>
+          <w:sz w:val="16"/>
+          <w:szCs w:val="16"/>
+        </w:rPr>
         <w:drawing>
           <wp:inline distT="0" distB="0" distL="0" distR="0" wp14:anchorId="2F467EF6" wp14:editId="715EE988">
             <wp:extent cx="6415719" cy="3207860"/>
@@ -1656,26 +1351,14 @@
         </w:rPr>
         <w:t xml:space="preserve">Classification accuracy </w:t>
       </w:r>
-      <w:del w:id="13" w:author="Daniel Schindler" w:date="2025-10-25T09:40:00Z" w16du:dateUtc="2025-10-25T16:40:00Z">
-        <w:r>
-          <w:rPr>
-            <w:rFonts w:ascii="Garamond" w:hAnsi="Garamond"/>
-            <w:sz w:val="22"/>
-            <w:szCs w:val="22"/>
-          </w:rPr>
-          <w:delText>with an imposed</w:delText>
-        </w:r>
-      </w:del>
-      <w:ins w:id="14" w:author="Daniel Schindler" w:date="2025-10-25T09:40:00Z" w16du:dateUtc="2025-10-25T16:40:00Z">
-        <w:r>
-          <w:rPr>
-            <w:rFonts w:ascii="Garamond" w:hAnsi="Garamond"/>
-            <w:sz w:val="22"/>
-            <w:szCs w:val="22"/>
-          </w:rPr>
-          <w:t>with different</w:t>
-        </w:r>
-      </w:ins>
+      <w:r>
+        <w:rPr>
+          <w:rFonts w:ascii="Garamond" w:hAnsi="Garamond"/>
+          <w:sz w:val="22"/>
+          <w:szCs w:val="22"/>
+        </w:rPr>
+        <w:t>with different</w:t>
+      </w:r>
       <w:r>
         <w:rPr>
           <w:rFonts w:ascii="Garamond" w:hAnsi="Garamond"/>
@@ -1684,16 +1367,14 @@
         </w:rPr>
         <w:t xml:space="preserve"> probability threshold</w:t>
       </w:r>
-      <w:ins w:id="15" w:author="Daniel Schindler" w:date="2025-10-25T09:40:00Z" w16du:dateUtc="2025-10-25T16:40:00Z">
-        <w:r>
-          <w:rPr>
-            <w:rFonts w:ascii="Garamond" w:hAnsi="Garamond"/>
-            <w:sz w:val="22"/>
-            <w:szCs w:val="22"/>
-          </w:rPr>
-          <w:t>s</w:t>
-        </w:r>
-      </w:ins>
+      <w:r>
+        <w:rPr>
+          <w:rFonts w:ascii="Garamond" w:hAnsi="Garamond"/>
+          <w:sz w:val="22"/>
+          <w:szCs w:val="22"/>
+        </w:rPr>
+        <w:t>s</w:t>
+      </w:r>
       <w:r>
         <w:rPr>
           <w:rFonts w:ascii="Garamond" w:hAnsi="Garamond"/>
@@ -1803,7 +1484,7 @@
       </w:r>
     </w:p>
   </w:comment>
-  <w:comment w:id="2" w:author="Daniel Schindler" w:date="2025-10-25T09:36:00Z" w:initials="DS">
+  <w:comment w:id="2" w:author="Daniel Schindler" w:date="2025-10-25T09:39:00Z" w:initials="DS">
     <w:p>
       <w:pPr>
         <w:pStyle w:val="CommentText"/>
@@ -1815,71 +1496,71 @@
         <w:annotationRef/>
       </w:r>
       <w:r>
+        <w:t>But what is a data point on this figure? Don’t you have hundreds of data points on each sample?</w:t>
+      </w:r>
+    </w:p>
+  </w:comment>
+  <w:comment w:id="3" w:author="Daniel Schindler" w:date="2025-10-06T11:10:00Z" w:initials="DS">
+    <w:p>
+      <w:pPr>
+        <w:pStyle w:val="CommentText"/>
+      </w:pPr>
+      <w:r>
+        <w:rPr>
+          <w:rStyle w:val="CommentReference"/>
+        </w:rPr>
+        <w:annotationRef/>
+      </w:r>
+      <w:r>
+        <w:t>This is a cool result which is not particularly well highlighted in the Discussion. Might want to think about how to highlight these results more.</w:t>
+      </w:r>
+    </w:p>
+  </w:comment>
+  <w:comment w:id="4" w:author="Daniel Schindler" w:date="2025-10-06T11:10:00Z" w:initials="DS">
+    <w:p>
+      <w:pPr>
+        <w:pStyle w:val="CommentText"/>
+      </w:pPr>
+      <w:r>
+        <w:rPr>
+          <w:rStyle w:val="CommentReference"/>
+        </w:rPr>
+        <w:annotationRef/>
+      </w:r>
+      <w:r>
+        <w:t>Fonts are very small</w:t>
+      </w:r>
+    </w:p>
+  </w:comment>
+  <w:comment w:id="5" w:author="Daniel Schindler" w:date="2025-10-25T09:42:00Z" w:initials="DS">
+    <w:p>
+      <w:pPr>
+        <w:pStyle w:val="CommentText"/>
+      </w:pPr>
+      <w:r>
+        <w:rPr>
+          <w:rStyle w:val="CommentReference"/>
+        </w:rPr>
+        <w:annotationRef/>
+      </w:r>
+      <w:r>
+        <w:t>I think you should sneak in a subtitle on the B panels that says something like ‘loading on PC1, PC2, etc)</w:t>
+      </w:r>
+    </w:p>
+  </w:comment>
+  <w:comment w:id="6" w:author="Daniel Schindler" w:date="2025-10-25T09:36:00Z" w:initials="DS">
+    <w:p>
+      <w:pPr>
+        <w:pStyle w:val="CommentText"/>
+      </w:pPr>
+      <w:r>
+        <w:rPr>
+          <w:rStyle w:val="CommentReference"/>
+        </w:rPr>
+        <w:annotationRef/>
+      </w:r>
+      <w:r>
         <w:t>So the numbers are the number of fish in each box from the test sample set? Not sure what the numbers are...</w:t>
-      </w:r>
-    </w:p>
-  </w:comment>
-  <w:comment w:id="5" w:author="Daniel Schindler" w:date="2025-10-25T09:39:00Z" w:initials="DS">
-    <w:p>
-      <w:pPr>
-        <w:pStyle w:val="CommentText"/>
-      </w:pPr>
-      <w:r>
-        <w:rPr>
-          <w:rStyle w:val="CommentReference"/>
-        </w:rPr>
-        <w:annotationRef/>
-      </w:r>
-      <w:r>
-        <w:t>But what is a data point on this figure? Don’t you have hundreds of data points on each sample?</w:t>
-      </w:r>
-    </w:p>
-  </w:comment>
-  <w:comment w:id="10" w:author="Daniel Schindler" w:date="2025-10-06T11:10:00Z" w:initials="DS">
-    <w:p>
-      <w:pPr>
-        <w:pStyle w:val="CommentText"/>
-      </w:pPr>
-      <w:r>
-        <w:rPr>
-          <w:rStyle w:val="CommentReference"/>
-        </w:rPr>
-        <w:annotationRef/>
-      </w:r>
-      <w:r>
-        <w:t>This is a cool result which is not particularly well highlighted in the Discussion. Might want to think about how to highlight these results more.</w:t>
-      </w:r>
-    </w:p>
-  </w:comment>
-  <w:comment w:id="11" w:author="Daniel Schindler" w:date="2025-10-06T11:10:00Z" w:initials="DS">
-    <w:p>
-      <w:pPr>
-        <w:pStyle w:val="CommentText"/>
-      </w:pPr>
-      <w:r>
-        <w:rPr>
-          <w:rStyle w:val="CommentReference"/>
-        </w:rPr>
-        <w:annotationRef/>
-      </w:r>
-      <w:r>
-        <w:t>Fonts are very small</w:t>
-      </w:r>
-    </w:p>
-  </w:comment>
-  <w:comment w:id="12" w:author="Daniel Schindler" w:date="2025-10-25T09:42:00Z" w:initials="DS">
-    <w:p>
-      <w:pPr>
-        <w:pStyle w:val="CommentText"/>
-      </w:pPr>
-      <w:r>
-        <w:rPr>
-          <w:rStyle w:val="CommentReference"/>
-        </w:rPr>
-        <w:annotationRef/>
-      </w:r>
-      <w:r>
-        <w:t>I think you should sneak in a subtitle on the B panels that says something like ‘loading on PC1, PC2, etc)</w:t>
       </w:r>
     </w:p>
   </w:comment>
@@ -1890,11 +1571,11 @@
 <w15:commentsEx xmlns:wpc="http://schemas.microsoft.com/office/word/2010/wordprocessingCanvas" xmlns:cx="http://schemas.microsoft.com/office/drawing/2014/chartex" xmlns:cx1="http://schemas.microsoft.com/office/drawing/2015/9/8/chartex" xmlns:cx2="http://schemas.microsoft.com/office/drawing/2015/10/21/chartex" xmlns:cx3="http://schemas.microsoft.com/office/drawing/2016/5/9/chartex" xmlns:cx4="http://schemas.microsoft.com/office/drawing/2016/5/10/chartex" xmlns:cx5="http://schemas.microsoft.com/office/drawing/2016/5/11/chartex" xmlns:cx6="http://schemas.microsoft.com/office/drawing/2016/5/12/chartex" xmlns:cx7="http://schemas.microsoft.com/office/drawing/2016/5/13/chartex" xmlns:cx8="http://schemas.microsoft.com/office/drawing/2016/5/14/chartex" xmlns:mc="http://schemas.openxmlformats.org/markup-compatibility/2006" xmlns:aink="http://schemas.microsoft.com/office/drawing/2016/ink" xmlns:am3d="http://schemas.microsoft.com/office/drawing/2017/model3d" xmlns:o="urn:schemas-microsoft-com:office:office" xmlns:oel="http://schemas.microsoft.com/office/2019/extlst" xmlns:r="http://schemas.openxmlformats.org/officeDocument/2006/relationships" xmlns:m="http://schemas.openxmlformats.org/officeDocument/2006/math" xmlns:v="urn:schemas-microsoft-com:vml" xmlns:wp14="http://schemas.microsoft.com/office/word/2010/wordprocessingDrawing" xmlns:wp="http://schemas.openxmlformats.org/drawingml/2006/wordprocessingDrawing" xmlns:w10="urn:schemas-microsoft-com:office:word" xmlns:w="http://schemas.openxmlformats.org/wordprocessingml/2006/main" xmlns:w14="http://schemas.microsoft.com/office/word/2010/wordml" xmlns:w15="http://schemas.microsoft.com/office/word/2012/wordml" xmlns:w16cex="http://schemas.microsoft.com/office/word/2018/wordml/cex" xmlns:w16cid="http://schemas.microsoft.com/office/word/2016/wordml/cid" xmlns:w16="http://schemas.microsoft.com/office/word/2018/wordml" xmlns:w16du="http://schemas.microsoft.com/office/word/2023/wordml/word16du" xmlns:w16sdtdh="http://schemas.microsoft.com/office/word/2020/wordml/sdtdatahash" xmlns:w16sdtfl="http://schemas.microsoft.com/office/word/2024/wordml/sdtformatlock" xmlns:w16se="http://schemas.microsoft.com/office/word/2015/wordml/symex" xmlns:wpg="http://schemas.microsoft.com/office/word/2010/wordprocessingGroup" xmlns:wpi="http://schemas.microsoft.com/office/word/2010/wordprocessingInk" xmlns:wne="http://schemas.microsoft.com/office/word/2006/wordml" xmlns:wps="http://schemas.microsoft.com/office/word/2010/wordprocessingShape" mc:Ignorable="w14 w15 w16se w16cid w16 w16cex w16sdtdh w16sdtfl w16du wp14">
   <w15:commentEx w15:paraId="0D283BE3" w15:done="1"/>
   <w15:commentEx w15:paraId="4EB50266" w15:done="0"/>
+  <w15:commentEx w15:paraId="3D39DE71" w15:done="0"/>
+  <w15:commentEx w15:paraId="07703636" w15:done="0"/>
+  <w15:commentEx w15:paraId="76DC7C46" w15:paraIdParent="07703636" w15:done="0"/>
+  <w15:commentEx w15:paraId="03986E4A" w15:done="0"/>
   <w15:commentEx w15:paraId="41505919" w15:done="0"/>
-  <w15:commentEx w15:paraId="2DCA7784" w15:done="0"/>
-  <w15:commentEx w15:paraId="0DD29C92" w15:done="0"/>
-  <w15:commentEx w15:paraId="40117E77" w15:paraIdParent="0DD29C92" w15:done="0"/>
-  <w15:commentEx w15:paraId="158273AC" w15:done="0"/>
 </w15:commentsEx>
 </file>
 
@@ -1902,11 +1583,11 @@
 <w16cex:commentsExtensible xmlns:wpc="http://schemas.microsoft.com/office/word/2010/wordprocessingCanvas" xmlns:cx="http://schemas.microsoft.com/office/drawing/2014/chartex" xmlns:cx1="http://schemas.microsoft.com/office/drawing/2015/9/8/chartex" xmlns:cx2="http://schemas.microsoft.com/office/drawing/2015/10/21/chartex" xmlns:cx3="http://schemas.microsoft.com/office/drawing/2016/5/9/chartex" xmlns:cx4="http://schemas.microsoft.com/office/drawing/2016/5/10/chartex" xmlns:cx5="http://schemas.microsoft.com/office/drawing/2016/5/11/chartex" xmlns:cx6="http://schemas.microsoft.com/office/drawing/2016/5/12/chartex" xmlns:cx7="http://schemas.microsoft.com/office/drawing/2016/5/13/chartex" xmlns:cx8="http://schemas.microsoft.com/office/drawing/2016/5/14/chartex" xmlns:cr="http://schemas.microsoft.com/office/comments/2020/reactions" xmlns:mc="http://schemas.openxmlformats.org/markup-compatibility/2006" xmlns:aink="http://schemas.microsoft.com/office/drawing/2016/ink" xmlns:am3d="http://schemas.microsoft.com/office/drawing/2017/model3d" xmlns:o="urn:schemas-microsoft-com:office:office" xmlns:oel="http://schemas.microsoft.com/office/2019/extlst" xmlns:r="http://schemas.openxmlformats.org/officeDocument/2006/relationships" xmlns:m="http://schemas.openxmlformats.org/officeDocument/2006/math" xmlns:v="urn:schemas-microsoft-com:vml" xmlns:wp14="http://schemas.microsoft.com/office/word/2010/wordprocessingDrawing" xmlns:wp="http://schemas.openxmlformats.org/drawingml/2006/wordprocessingDrawing" xmlns:w10="urn:schemas-microsoft-com:office:word" xmlns:w="http://schemas.openxmlformats.org/wordprocessingml/2006/main" xmlns:w14="http://schemas.microsoft.com/office/word/2010/wordml" xmlns:w15="http://schemas.microsoft.com/office/word/2012/wordml" xmlns:w16cex="http://schemas.microsoft.com/office/word/2018/wordml/cex" xmlns:w16cid="http://schemas.microsoft.com/office/word/2016/wordml/cid" xmlns:w16="http://schemas.microsoft.com/office/word/2018/wordml" xmlns:w16du="http://schemas.microsoft.com/office/word/2023/wordml/word16du" xmlns:w16sdtdh="http://schemas.microsoft.com/office/word/2020/wordml/sdtdatahash" xmlns:w16sdtfl="http://schemas.microsoft.com/office/word/2024/wordml/sdtformatlock" xmlns:w16se="http://schemas.microsoft.com/office/word/2015/wordml/symex" xmlns:wpg="http://schemas.microsoft.com/office/word/2010/wordprocessingGroup" xmlns:wpi="http://schemas.microsoft.com/office/word/2010/wordprocessingInk" xmlns:wne="http://schemas.microsoft.com/office/word/2006/wordml" xmlns:wps="http://schemas.microsoft.com/office/word/2010/wordprocessingShape" mc:Ignorable="w14 w15 w16se w16cid w16 w16cex w16sdtdh w16sdtfl cr w16du wp14">
   <w16cex:commentExtensible w16cex:durableId="097BE8A5" w16cex:dateUtc="2025-10-25T16:30:00Z"/>
   <w16cex:commentExtensible w16cex:durableId="415B9344" w16cex:dateUtc="2025-10-25T16:43:00Z"/>
-  <w16cex:commentExtensible w16cex:durableId="6CEAFE59" w16cex:dateUtc="2025-10-25T16:36:00Z"/>
-  <w16cex:commentExtensible w16cex:durableId="703AA666" w16cex:dateUtc="2025-10-25T16:39:00Z"/>
+  <w16cex:commentExtensible w16cex:durableId="6DA82EFB" w16cex:dateUtc="2025-10-25T16:39:00Z"/>
   <w16cex:commentExtensible w16cex:durableId="11D61FD6" w16cex:dateUtc="2025-10-06T18:10:00Z"/>
   <w16cex:commentExtensible w16cex:durableId="7531CF4E" w16cex:dateUtc="2025-10-06T18:10:00Z"/>
   <w16cex:commentExtensible w16cex:durableId="13446255" w16cex:dateUtc="2025-10-25T16:42:00Z"/>
+  <w16cex:commentExtensible w16cex:durableId="6CEAFE59" w16cex:dateUtc="2025-10-25T16:36:00Z"/>
 </w16cex:commentsExtensible>
 </file>
 
@@ -1914,11 +1595,11 @@
 <w16cid:commentsIds xmlns:wpc="http://schemas.microsoft.com/office/word/2010/wordprocessingCanvas" xmlns:cx="http://schemas.microsoft.com/office/drawing/2014/chartex" xmlns:cx1="http://schemas.microsoft.com/office/drawing/2015/9/8/chartex" xmlns:cx2="http://schemas.microsoft.com/office/drawing/2015/10/21/chartex" xmlns:cx3="http://schemas.microsoft.com/office/drawing/2016/5/9/chartex" xmlns:cx4="http://schemas.microsoft.com/office/drawing/2016/5/10/chartex" xmlns:cx5="http://schemas.microsoft.com/office/drawing/2016/5/11/chartex" xmlns:cx6="http://schemas.microsoft.com/office/drawing/2016/5/12/chartex" xmlns:cx7="http://schemas.microsoft.com/office/drawing/2016/5/13/chartex" xmlns:cx8="http://schemas.microsoft.com/office/drawing/2016/5/14/chartex" xmlns:mc="http://schemas.openxmlformats.org/markup-compatibility/2006" xmlns:aink="http://schemas.microsoft.com/office/drawing/2016/ink" xmlns:am3d="http://schemas.microsoft.com/office/drawing/2017/model3d" xmlns:o="urn:schemas-microsoft-com:office:office" xmlns:oel="http://schemas.microsoft.com/office/2019/extlst" xmlns:r="http://schemas.openxmlformats.org/officeDocument/2006/relationships" xmlns:m="http://schemas.openxmlformats.org/officeDocument/2006/math" xmlns:v="urn:schemas-microsoft-com:vml" xmlns:wp14="http://schemas.microsoft.com/office/word/2010/wordprocessingDrawing" xmlns:wp="http://schemas.openxmlformats.org/drawingml/2006/wordprocessingDrawing" xmlns:w10="urn:schemas-microsoft-com:office:word" xmlns:w="http://schemas.openxmlformats.org/wordprocessingml/2006/main" xmlns:w14="http://schemas.microsoft.com/office/word/2010/wordml" xmlns:w15="http://schemas.microsoft.com/office/word/2012/wordml" xmlns:w16cex="http://schemas.microsoft.com/office/word/2018/wordml/cex" xmlns:w16cid="http://schemas.microsoft.com/office/word/2016/wordml/cid" xmlns:w16="http://schemas.microsoft.com/office/word/2018/wordml" xmlns:w16du="http://schemas.microsoft.com/office/word/2023/wordml/word16du" xmlns:w16sdtdh="http://schemas.microsoft.com/office/word/2020/wordml/sdtdatahash" xmlns:w16sdtfl="http://schemas.microsoft.com/office/word/2024/wordml/sdtformatlock" xmlns:w16se="http://schemas.microsoft.com/office/word/2015/wordml/symex" xmlns:wpg="http://schemas.microsoft.com/office/word/2010/wordprocessingGroup" xmlns:wpi="http://schemas.microsoft.com/office/word/2010/wordprocessingInk" xmlns:wne="http://schemas.microsoft.com/office/word/2006/wordml" xmlns:wps="http://schemas.microsoft.com/office/word/2010/wordprocessingShape" mc:Ignorable="w14 w15 w16se w16cid w16 w16cex w16sdtdh w16sdtfl w16du wp14">
   <w16cid:commentId w16cid:paraId="0D283BE3" w16cid:durableId="097BE8A5"/>
   <w16cid:commentId w16cid:paraId="4EB50266" w16cid:durableId="415B9344"/>
+  <w16cid:commentId w16cid:paraId="3D39DE71" w16cid:durableId="6DA82EFB"/>
+  <w16cid:commentId w16cid:paraId="07703636" w16cid:durableId="11D61FD6"/>
+  <w16cid:commentId w16cid:paraId="76DC7C46" w16cid:durableId="7531CF4E"/>
+  <w16cid:commentId w16cid:paraId="03986E4A" w16cid:durableId="13446255"/>
   <w16cid:commentId w16cid:paraId="41505919" w16cid:durableId="6CEAFE59"/>
-  <w16cid:commentId w16cid:paraId="2DCA7784" w16cid:durableId="703AA666"/>
-  <w16cid:commentId w16cid:paraId="0DD29C92" w16cid:durableId="11D61FD6"/>
-  <w16cid:commentId w16cid:paraId="40117E77" w16cid:durableId="7531CF4E"/>
-  <w16cid:commentId w16cid:paraId="158273AC" w16cid:durableId="13446255"/>
 </w16cid:commentsIds>
 </file>
 

</xml_diff>